<commit_message>
Currently extending the implementation of the DHCP and DHCPServer classes, also work shoudl commence on working on the Packet class, maybe to get the ability to create dynamic data and headers within each package
</commit_message>
<xml_diff>
--- a/Mini Network Simulator with Java.docx
+++ b/Mini Network Simulator with Java.docx
@@ -25,6 +25,1387 @@
       <w:proofErr w:type="spellStart"/>
       <w:r>
         <w:t>Specification</w:t>
+      </w:r>
+      <w:proofErr w:type="spellEnd"/>
+      <w:r>
+        <w:t xml:space="preserve"> and </w:t>
+      </w:r>
+      <w:proofErr w:type="spellStart"/>
+      <w:r>
+        <w:t>Reference</w:t>
+      </w:r>
+      <w:proofErr w:type="spellEnd"/>
+    </w:p>
+    <w:p>
+      <w:pPr>
+        <w:pStyle w:val="Heading1"/>
+      </w:pPr>
+      <w:proofErr w:type="spellStart"/>
+      <w:r>
+        <w:t>Applications</w:t>
+      </w:r>
+      <w:proofErr w:type="spellEnd"/>
+      <w:r>
+        <w:t xml:space="preserve"> </w:t>
+      </w:r>
+      <w:proofErr w:type="spellStart"/>
+      <w:r>
+        <w:t>on</w:t>
+      </w:r>
+      <w:proofErr w:type="spellEnd"/>
+      <w:r>
+        <w:t xml:space="preserve"> </w:t>
+      </w:r>
+      <w:proofErr w:type="spellStart"/>
+      <w:r>
+        <w:t>different</w:t>
+      </w:r>
+      <w:proofErr w:type="spellEnd"/>
+      <w:r>
+        <w:t xml:space="preserve"> </w:t>
+      </w:r>
+      <w:proofErr w:type="spellStart"/>
+      <w:r>
+        <w:t>transport</w:t>
+      </w:r>
+      <w:proofErr w:type="spellEnd"/>
+      <w:r>
+        <w:t xml:space="preserve"> </w:t>
+      </w:r>
+      <w:proofErr w:type="spellStart"/>
+      <w:r>
+        <w:t>layer</w:t>
+      </w:r>
+      <w:proofErr w:type="spellEnd"/>
+      <w:r>
+        <w:t xml:space="preserve"> </w:t>
+      </w:r>
+      <w:proofErr w:type="spellStart"/>
+      <w:r>
+        <w:t>protocols</w:t>
+      </w:r>
+      <w:proofErr w:type="spellEnd"/>
+    </w:p>
+    <w:p>
+      <w:r>
+        <w:drawing>
+          <wp:inline distT="0" distB="0" distL="0" distR="0" wp14:anchorId="433195F5" wp14:editId="3D53E8A3">
+            <wp:extent cx="5760720" cy="3574415"/>
+            <wp:effectExtent l="0" t="0" r="0" b="6985"/>
+            <wp:docPr id="1081460500" name="Picture 1"/>
+            <wp:cNvGraphicFramePr>
+              <a:graphicFrameLocks xmlns:a="http://schemas.openxmlformats.org/drawingml/2006/main" noChangeAspect="1"/>
+            </wp:cNvGraphicFramePr>
+            <a:graphic xmlns:a="http://schemas.openxmlformats.org/drawingml/2006/main">
+              <a:graphicData uri="http://schemas.openxmlformats.org/drawingml/2006/picture">
+                <pic:pic xmlns:pic="http://schemas.openxmlformats.org/drawingml/2006/picture">
+                  <pic:nvPicPr>
+                    <pic:cNvPr id="1081460500" name=""/>
+                    <pic:cNvPicPr/>
+                  </pic:nvPicPr>
+                  <pic:blipFill>
+                    <a:blip r:embed="rId5"/>
+                    <a:stretch>
+                      <a:fillRect/>
+                    </a:stretch>
+                  </pic:blipFill>
+                  <pic:spPr>
+                    <a:xfrm>
+                      <a:off x="0" y="0"/>
+                      <a:ext cx="5760720" cy="3574415"/>
+                    </a:xfrm>
+                    <a:prstGeom prst="rect">
+                      <a:avLst/>
+                    </a:prstGeom>
+                  </pic:spPr>
+                </pic:pic>
+              </a:graphicData>
+            </a:graphic>
+          </wp:inline>
+        </w:drawing>
+      </w:r>
+    </w:p>
+    <w:p>
+      <w:pPr>
+        <w:pStyle w:val="Heading2"/>
+      </w:pPr>
+      <w:r>
+        <w:t xml:space="preserve">IP </w:t>
+      </w:r>
+      <w:proofErr w:type="spellStart"/>
+      <w:r>
+        <w:t>Protocoll</w:t>
+      </w:r>
+      <w:proofErr w:type="spellEnd"/>
+      <w:r>
+        <w:t xml:space="preserve"> </w:t>
+      </w:r>
+      <w:proofErr w:type="spellStart"/>
+      <w:r>
+        <w:t>field</w:t>
+      </w:r>
+      <w:proofErr w:type="spellEnd"/>
+      <w:r>
+        <w:t xml:space="preserve"> </w:t>
+      </w:r>
+      <w:proofErr w:type="spellStart"/>
+      <w:r>
+        <w:t>values</w:t>
+      </w:r>
+      <w:proofErr w:type="spellEnd"/>
+      <w:r>
+        <w:t xml:space="preserve"> o</w:t>
+      </w:r>
+      <w:r>
+        <w:t xml:space="preserve">ver </w:t>
+      </w:r>
+      <w:proofErr w:type="spellStart"/>
+      <w:r>
+        <w:t>Native</w:t>
+      </w:r>
+      <w:proofErr w:type="spellEnd"/>
+      <w:r>
+        <w:t xml:space="preserve"> IP</w:t>
+      </w:r>
+    </w:p>
+    <w:p>
+      <w:proofErr w:type="spellStart"/>
+      <w:r>
+        <w:t>Control</w:t>
+      </w:r>
+      <w:proofErr w:type="spellEnd"/>
+      <w:r>
+        <w:t xml:space="preserve">: </w:t>
+      </w:r>
+    </w:p>
+    <w:p>
+      <w:pPr>
+        <w:pStyle w:val="ListParagraph"/>
+        <w:numPr>
+          <w:ilvl w:val="0"/>
+          <w:numId w:val="6"/>
+        </w:numPr>
+      </w:pPr>
+      <w:r>
+        <w:t>ICMP</w:t>
+      </w:r>
+    </w:p>
+    <w:p>
+      <w:proofErr w:type="spellStart"/>
+      <w:r>
+        <w:t>Routing</w:t>
+      </w:r>
+      <w:proofErr w:type="spellEnd"/>
+    </w:p>
+    <w:p>
+      <w:pPr>
+        <w:pStyle w:val="ListParagraph"/>
+        <w:numPr>
+          <w:ilvl w:val="0"/>
+          <w:numId w:val="5"/>
+        </w:numPr>
+      </w:pPr>
+      <w:r>
+        <w:t>89</w:t>
+      </w:r>
+      <w:r>
+        <w:tab/>
+        <w:t xml:space="preserve">OSPF (Open </w:t>
+      </w:r>
+      <w:proofErr w:type="spellStart"/>
+      <w:r>
+        <w:t>Shortest</w:t>
+      </w:r>
+      <w:proofErr w:type="spellEnd"/>
+      <w:r>
+        <w:t xml:space="preserve"> </w:t>
+      </w:r>
+      <w:proofErr w:type="spellStart"/>
+      <w:r>
+        <w:t>Path</w:t>
+      </w:r>
+      <w:proofErr w:type="spellEnd"/>
+      <w:r>
+        <w:t xml:space="preserve"> </w:t>
+      </w:r>
+      <w:proofErr w:type="spellStart"/>
+      <w:r>
+        <w:t>First</w:t>
+      </w:r>
+      <w:proofErr w:type="spellEnd"/>
+      <w:r>
+        <w:t>)</w:t>
+      </w:r>
+    </w:p>
+    <w:p>
+      <w:r>
+        <w:t xml:space="preserve">Real </w:t>
+      </w:r>
+      <w:proofErr w:type="spellStart"/>
+      <w:r>
+        <w:t>Transport</w:t>
+      </w:r>
+      <w:proofErr w:type="spellEnd"/>
+      <w:r>
+        <w:t xml:space="preserve"> </w:t>
+      </w:r>
+      <w:proofErr w:type="spellStart"/>
+      <w:r>
+        <w:t>Layer</w:t>
+      </w:r>
+      <w:proofErr w:type="spellEnd"/>
+      <w:r>
+        <w:t xml:space="preserve"> </w:t>
+      </w:r>
+      <w:proofErr w:type="spellStart"/>
+      <w:r>
+        <w:t>Protocols</w:t>
+      </w:r>
+      <w:proofErr w:type="spellEnd"/>
+    </w:p>
+    <w:p>
+      <w:pPr>
+        <w:pStyle w:val="ListParagraph"/>
+        <w:numPr>
+          <w:ilvl w:val="0"/>
+          <w:numId w:val="4"/>
+        </w:numPr>
+      </w:pPr>
+      <w:r>
+        <w:t>6</w:t>
+      </w:r>
+      <w:r>
+        <w:tab/>
+        <w:t>TCP</w:t>
+      </w:r>
+    </w:p>
+    <w:p>
+      <w:pPr>
+        <w:pStyle w:val="ListParagraph"/>
+        <w:numPr>
+          <w:ilvl w:val="0"/>
+          <w:numId w:val="4"/>
+        </w:numPr>
+      </w:pPr>
+      <w:r>
+        <w:t>17</w:t>
+      </w:r>
+      <w:r>
+        <w:tab/>
+        <w:t>UDP</w:t>
+      </w:r>
+    </w:p>
+    <w:p>
+      <w:pPr>
+        <w:pStyle w:val="Heading2"/>
+      </w:pPr>
+      <w:proofErr w:type="spellStart"/>
+      <w:r>
+        <w:t>Services</w:t>
+      </w:r>
+      <w:proofErr w:type="spellEnd"/>
+      <w:r>
+        <w:t xml:space="preserve"> </w:t>
+      </w:r>
+      <w:proofErr w:type="spellStart"/>
+      <w:r>
+        <w:t>using</w:t>
+      </w:r>
+      <w:proofErr w:type="spellEnd"/>
+      <w:r>
+        <w:t xml:space="preserve"> </w:t>
+      </w:r>
+      <w:proofErr w:type="spellStart"/>
+      <w:r>
+        <w:t>portnumbers</w:t>
+      </w:r>
+      <w:proofErr w:type="spellEnd"/>
+      <w:r>
+        <w:t xml:space="preserve"> over</w:t>
+      </w:r>
+      <w:r>
+        <w:t xml:space="preserve"> </w:t>
+      </w:r>
+      <w:r>
+        <w:t>UDP</w:t>
+      </w:r>
+    </w:p>
+    <w:p>
+      <w:pPr>
+        <w:pStyle w:val="Heading3"/>
+      </w:pPr>
+      <w:proofErr w:type="spellStart"/>
+      <w:r>
+        <w:t>Serverside</w:t>
+      </w:r>
+      <w:proofErr w:type="spellEnd"/>
+      <w:r>
+        <w:t xml:space="preserve"> </w:t>
+      </w:r>
+      <w:proofErr w:type="spellStart"/>
+      <w:proofErr w:type="gramStart"/>
+      <w:r>
+        <w:t>Portnumber</w:t>
+      </w:r>
+      <w:proofErr w:type="spellEnd"/>
+      <w:r>
+        <w:t xml:space="preserve">  </w:t>
+      </w:r>
+      <w:proofErr w:type="spellStart"/>
+      <w:r>
+        <w:t>Values</w:t>
+      </w:r>
+      <w:proofErr w:type="spellEnd"/>
+      <w:proofErr w:type="gramEnd"/>
+    </w:p>
+    <w:p>
+      <w:pPr>
+        <w:pStyle w:val="ListParagraph"/>
+        <w:numPr>
+          <w:ilvl w:val="0"/>
+          <w:numId w:val="8"/>
+        </w:numPr>
+      </w:pPr>
+      <w:r>
+        <w:t>53</w:t>
+      </w:r>
+      <w:r>
+        <w:tab/>
+        <w:t>DNS</w:t>
+      </w:r>
+    </w:p>
+    <w:p>
+      <w:pPr>
+        <w:pStyle w:val="ListParagraph"/>
+        <w:numPr>
+          <w:ilvl w:val="0"/>
+          <w:numId w:val="8"/>
+        </w:numPr>
+        <w:rPr>
+          <w:b/>
+          <w:bCs/>
+        </w:rPr>
+      </w:pPr>
+      <w:r>
+        <w:t>67</w:t>
+      </w:r>
+      <w:r>
+        <w:tab/>
+        <w:t>BOOTP/</w:t>
+      </w:r>
+      <w:r>
+        <w:rPr>
+          <w:b/>
+          <w:bCs/>
+        </w:rPr>
+        <w:t xml:space="preserve">DHCP (Server </w:t>
+      </w:r>
+      <w:proofErr w:type="spellStart"/>
+      <w:r>
+        <w:rPr>
+          <w:b/>
+          <w:bCs/>
+        </w:rPr>
+        <w:t>side</w:t>
+      </w:r>
+      <w:proofErr w:type="spellEnd"/>
+      <w:r>
+        <w:rPr>
+          <w:b/>
+          <w:bCs/>
+        </w:rPr>
+        <w:t>)</w:t>
+      </w:r>
+    </w:p>
+    <w:p>
+      <w:pPr>
+        <w:pStyle w:val="ListParagraph"/>
+        <w:numPr>
+          <w:ilvl w:val="0"/>
+          <w:numId w:val="8"/>
+        </w:numPr>
+      </w:pPr>
+      <w:r>
+        <w:t>68</w:t>
+      </w:r>
+      <w:r>
+        <w:tab/>
+        <w:t>DHCP (</w:t>
+      </w:r>
+      <w:proofErr w:type="spellStart"/>
+      <w:r>
+        <w:t>Client</w:t>
+      </w:r>
+      <w:proofErr w:type="spellEnd"/>
+      <w:r>
+        <w:t xml:space="preserve"> </w:t>
+      </w:r>
+      <w:proofErr w:type="spellStart"/>
+      <w:r>
+        <w:t>side</w:t>
+      </w:r>
+      <w:proofErr w:type="spellEnd"/>
+      <w:r>
+        <w:t>)</w:t>
+      </w:r>
+    </w:p>
+    <w:p>
+      <w:pPr>
+        <w:pStyle w:val="ListParagraph"/>
+        <w:numPr>
+          <w:ilvl w:val="0"/>
+          <w:numId w:val="8"/>
+        </w:numPr>
+      </w:pPr>
+      <w:r>
+        <w:lastRenderedPageBreak/>
+        <w:t>520</w:t>
+      </w:r>
+      <w:r>
+        <w:tab/>
+        <w:t>RIP (</w:t>
+      </w:r>
+      <w:proofErr w:type="spellStart"/>
+      <w:r>
+        <w:t>Routing</w:t>
+      </w:r>
+      <w:proofErr w:type="spellEnd"/>
+      <w:r>
+        <w:t xml:space="preserve"> </w:t>
+      </w:r>
+      <w:proofErr w:type="spellStart"/>
+      <w:r>
+        <w:t>Information</w:t>
+      </w:r>
+      <w:proofErr w:type="spellEnd"/>
+      <w:r>
+        <w:t xml:space="preserve"> </w:t>
+      </w:r>
+      <w:proofErr w:type="spellStart"/>
+      <w:r>
+        <w:t>Protocol</w:t>
+      </w:r>
+      <w:proofErr w:type="spellEnd"/>
+      <w:r>
+        <w:t>)</w:t>
+      </w:r>
+    </w:p>
+    <w:p>
+      <w:pPr>
+        <w:pStyle w:val="Heading2"/>
+      </w:pPr>
+      <w:proofErr w:type="spellStart"/>
+      <w:r>
+        <w:t>Services</w:t>
+      </w:r>
+      <w:proofErr w:type="spellEnd"/>
+      <w:r>
+        <w:t xml:space="preserve"> </w:t>
+      </w:r>
+      <w:r>
+        <w:t xml:space="preserve">and </w:t>
+      </w:r>
+      <w:proofErr w:type="spellStart"/>
+      <w:r>
+        <w:t>Protocols</w:t>
+      </w:r>
+      <w:proofErr w:type="spellEnd"/>
+      <w:r>
+        <w:t xml:space="preserve"> </w:t>
+      </w:r>
+      <w:proofErr w:type="spellStart"/>
+      <w:r>
+        <w:t>using</w:t>
+      </w:r>
+      <w:proofErr w:type="spellEnd"/>
+      <w:r>
+        <w:t xml:space="preserve"> </w:t>
+      </w:r>
+      <w:proofErr w:type="spellStart"/>
+      <w:r>
+        <w:t>portnumbers</w:t>
+      </w:r>
+      <w:proofErr w:type="spellEnd"/>
+      <w:r>
+        <w:t xml:space="preserve"> </w:t>
+      </w:r>
+      <w:r>
+        <w:t>o</w:t>
+      </w:r>
+      <w:r>
+        <w:t xml:space="preserve">ver </w:t>
+      </w:r>
+      <w:r>
+        <w:t>TCP</w:t>
+      </w:r>
+    </w:p>
+    <w:p>
+      <w:pPr>
+        <w:pStyle w:val="Heading3"/>
+      </w:pPr>
+      <w:proofErr w:type="spellStart"/>
+      <w:r>
+        <w:t>Serverside</w:t>
+      </w:r>
+      <w:proofErr w:type="spellEnd"/>
+      <w:r>
+        <w:t xml:space="preserve"> </w:t>
+      </w:r>
+      <w:proofErr w:type="spellStart"/>
+      <w:proofErr w:type="gramStart"/>
+      <w:r>
+        <w:t>Portnumber</w:t>
+      </w:r>
+      <w:proofErr w:type="spellEnd"/>
+      <w:r>
+        <w:t xml:space="preserve">  </w:t>
+      </w:r>
+      <w:proofErr w:type="spellStart"/>
+      <w:r>
+        <w:t>Values</w:t>
+      </w:r>
+      <w:proofErr w:type="spellEnd"/>
+      <w:proofErr w:type="gramEnd"/>
+    </w:p>
+    <w:p>
+      <w:pPr>
+        <w:pStyle w:val="ListParagraph"/>
+        <w:numPr>
+          <w:ilvl w:val="0"/>
+          <w:numId w:val="9"/>
+        </w:numPr>
+      </w:pPr>
+      <w:r>
+        <w:t>20-21</w:t>
+      </w:r>
+      <w:r>
+        <w:tab/>
+        <w:t>FTP</w:t>
+      </w:r>
+    </w:p>
+    <w:p>
+      <w:pPr>
+        <w:pStyle w:val="ListParagraph"/>
+        <w:numPr>
+          <w:ilvl w:val="0"/>
+          <w:numId w:val="9"/>
+        </w:numPr>
+      </w:pPr>
+      <w:r>
+        <w:t>22</w:t>
+      </w:r>
+      <w:r>
+        <w:tab/>
+        <w:t>SSH</w:t>
+      </w:r>
+    </w:p>
+    <w:p>
+      <w:pPr>
+        <w:pStyle w:val="ListParagraph"/>
+        <w:numPr>
+          <w:ilvl w:val="0"/>
+          <w:numId w:val="9"/>
+        </w:numPr>
+      </w:pPr>
+      <w:r>
+        <w:t>23</w:t>
+      </w:r>
+      <w:r>
+        <w:tab/>
+        <w:t>Telnet</w:t>
+      </w:r>
+    </w:p>
+    <w:p>
+      <w:pPr>
+        <w:pStyle w:val="ListParagraph"/>
+        <w:numPr>
+          <w:ilvl w:val="0"/>
+          <w:numId w:val="9"/>
+        </w:numPr>
+      </w:pPr>
+      <w:r>
+        <w:t>25</w:t>
+      </w:r>
+      <w:r>
+        <w:tab/>
+        <w:t>SMTP (</w:t>
+      </w:r>
+      <w:proofErr w:type="spellStart"/>
+      <w:r>
+        <w:t>Simple</w:t>
+      </w:r>
+      <w:proofErr w:type="spellEnd"/>
+      <w:r>
+        <w:t xml:space="preserve"> Mail </w:t>
+      </w:r>
+      <w:proofErr w:type="spellStart"/>
+      <w:r>
+        <w:t>Transfer</w:t>
+      </w:r>
+      <w:proofErr w:type="spellEnd"/>
+      <w:r>
+        <w:t xml:space="preserve"> </w:t>
+      </w:r>
+      <w:proofErr w:type="spellStart"/>
+      <w:r>
+        <w:t>Protocol</w:t>
+      </w:r>
+      <w:proofErr w:type="spellEnd"/>
+      <w:r>
+        <w:t>)</w:t>
+      </w:r>
+    </w:p>
+    <w:p>
+      <w:pPr>
+        <w:pStyle w:val="ListParagraph"/>
+        <w:numPr>
+          <w:ilvl w:val="0"/>
+          <w:numId w:val="9"/>
+        </w:numPr>
+      </w:pPr>
+      <w:r>
+        <w:t>53</w:t>
+      </w:r>
+      <w:r>
+        <w:tab/>
+        <w:t>DNS</w:t>
+      </w:r>
+    </w:p>
+    <w:p>
+      <w:pPr>
+        <w:pStyle w:val="ListParagraph"/>
+        <w:numPr>
+          <w:ilvl w:val="0"/>
+          <w:numId w:val="9"/>
+        </w:numPr>
+      </w:pPr>
+      <w:r>
+        <w:t>80</w:t>
+      </w:r>
+      <w:r>
+        <w:tab/>
+        <w:t>HTTP</w:t>
+      </w:r>
+    </w:p>
+    <w:p>
+      <w:pPr>
+        <w:pStyle w:val="ListParagraph"/>
+        <w:numPr>
+          <w:ilvl w:val="0"/>
+          <w:numId w:val="9"/>
+        </w:numPr>
+      </w:pPr>
+      <w:r>
+        <w:t>110</w:t>
+      </w:r>
+      <w:r>
+        <w:tab/>
+        <w:t>POP3</w:t>
+      </w:r>
+      <w:r>
+        <w:t xml:space="preserve"> (</w:t>
+      </w:r>
+      <w:r>
+        <w:t xml:space="preserve">Post Office </w:t>
+      </w:r>
+      <w:proofErr w:type="spellStart"/>
+      <w:r>
+        <w:t>Protocol</w:t>
+      </w:r>
+      <w:proofErr w:type="spellEnd"/>
+      <w:r>
+        <w:t xml:space="preserve"> version 3</w:t>
+      </w:r>
+      <w:r>
+        <w:t>)</w:t>
+      </w:r>
+    </w:p>
+    <w:p>
+      <w:pPr>
+        <w:pStyle w:val="ListParagraph"/>
+        <w:numPr>
+          <w:ilvl w:val="0"/>
+          <w:numId w:val="9"/>
+        </w:numPr>
+      </w:pPr>
+      <w:r>
+        <w:t>143</w:t>
+      </w:r>
+      <w:r>
+        <w:tab/>
+        <w:t>IMAP4 (</w:t>
+      </w:r>
+      <w:r>
+        <w:t xml:space="preserve">Internet </w:t>
+      </w:r>
+      <w:proofErr w:type="spellStart"/>
+      <w:r>
+        <w:t>Message</w:t>
+      </w:r>
+      <w:proofErr w:type="spellEnd"/>
+      <w:r>
+        <w:t xml:space="preserve"> Access </w:t>
+      </w:r>
+      <w:proofErr w:type="spellStart"/>
+      <w:r>
+        <w:t>Protocol</w:t>
+      </w:r>
+      <w:proofErr w:type="spellEnd"/>
+      <w:r>
+        <w:t xml:space="preserve"> version 4</w:t>
+      </w:r>
+      <w:r>
+        <w:t>)</w:t>
+      </w:r>
+    </w:p>
+    <w:p>
+      <w:pPr>
+        <w:pStyle w:val="ListParagraph"/>
+        <w:numPr>
+          <w:ilvl w:val="0"/>
+          <w:numId w:val="9"/>
+        </w:numPr>
+      </w:pPr>
+      <w:r>
+        <w:t>443</w:t>
+      </w:r>
+      <w:r>
+        <w:tab/>
+        <w:t>HTTPS</w:t>
+      </w:r>
+    </w:p>
+    <w:p>
+      <w:pPr>
+        <w:pStyle w:val="ListParagraph"/>
+        <w:numPr>
+          <w:ilvl w:val="0"/>
+          <w:numId w:val="9"/>
+        </w:numPr>
+      </w:pPr>
+      <w:r>
+        <w:t>465</w:t>
+      </w:r>
+      <w:r>
+        <w:tab/>
+        <w:t>SMTPS</w:t>
+      </w:r>
+    </w:p>
+    <w:p>
+      <w:pPr>
+        <w:pStyle w:val="ListParagraph"/>
+        <w:numPr>
+          <w:ilvl w:val="0"/>
+          <w:numId w:val="9"/>
+        </w:numPr>
+      </w:pPr>
+      <w:r>
+        <w:t>993</w:t>
+      </w:r>
+      <w:r>
+        <w:tab/>
+        <w:t>IMAP4S</w:t>
+      </w:r>
+    </w:p>
+    <w:p>
+      <w:pPr>
+        <w:pStyle w:val="ListParagraph"/>
+        <w:numPr>
+          <w:ilvl w:val="0"/>
+          <w:numId w:val="9"/>
+        </w:numPr>
+      </w:pPr>
+      <w:r>
+        <w:t>995</w:t>
+      </w:r>
+      <w:r>
+        <w:tab/>
+        <w:t>POP3S</w:t>
+      </w:r>
+      <w:r>
+        <w:t>ű</w:t>
+      </w:r>
+    </w:p>
+    <w:p>
+      <w:pPr>
+        <w:pStyle w:val="Heading1"/>
+      </w:pPr>
+      <w:r>
+        <w:t>DHCP</w:t>
+      </w:r>
+    </w:p>
+    <w:p>
+      <w:pPr>
+        <w:pStyle w:val="Heading2"/>
+      </w:pPr>
+      <w:r>
+        <w:t xml:space="preserve">DHCP </w:t>
+      </w:r>
+      <w:proofErr w:type="spellStart"/>
+      <w:r>
+        <w:t>Messages</w:t>
+      </w:r>
+      <w:proofErr w:type="spellEnd"/>
+    </w:p>
+    <w:p>
+      <w:pPr>
+        <w:pStyle w:val="Heading3"/>
+      </w:pPr>
+      <w:proofErr w:type="spellStart"/>
+      <w:r>
+        <w:t>Discover</w:t>
+      </w:r>
+      <w:proofErr w:type="spellEnd"/>
+    </w:p>
+    <w:p>
+      <w:proofErr w:type="spellStart"/>
+      <w:r>
+        <w:t>From</w:t>
+      </w:r>
+      <w:proofErr w:type="spellEnd"/>
+      <w:r>
+        <w:t xml:space="preserve"> 0.0.0.0 </w:t>
+      </w:r>
+      <w:proofErr w:type="spellStart"/>
+      <w:r>
+        <w:t>to</w:t>
+      </w:r>
+      <w:proofErr w:type="spellEnd"/>
+      <w:r>
+        <w:t xml:space="preserve"> 255.255.255.255</w:t>
+      </w:r>
+    </w:p>
+    <w:p>
+      <w:pPr>
+        <w:pStyle w:val="Heading3"/>
+      </w:pPr>
+      <w:proofErr w:type="spellStart"/>
+      <w:r>
+        <w:t>Offer</w:t>
+      </w:r>
+      <w:proofErr w:type="spellEnd"/>
+    </w:p>
+    <w:p>
+      <w:proofErr w:type="spellStart"/>
+      <w:r>
+        <w:t>to</w:t>
+      </w:r>
+      <w:proofErr w:type="spellEnd"/>
+      <w:r>
+        <w:t xml:space="preserve"> 255.255.255.255 </w:t>
+      </w:r>
+      <w:proofErr w:type="spellStart"/>
+      <w:r>
+        <w:t>from</w:t>
+      </w:r>
+      <w:proofErr w:type="spellEnd"/>
+      <w:r>
+        <w:t xml:space="preserve"> DHCP server </w:t>
+      </w:r>
+      <w:proofErr w:type="spellStart"/>
+      <w:r>
+        <w:t>address</w:t>
+      </w:r>
+      <w:proofErr w:type="spellEnd"/>
+    </w:p>
+    <w:p>
+      <w:pPr>
+        <w:pStyle w:val="ListParagraph"/>
+        <w:numPr>
+          <w:ilvl w:val="0"/>
+          <w:numId w:val="10"/>
+        </w:numPr>
+      </w:pPr>
+      <w:proofErr w:type="spellStart"/>
+      <w:r>
+        <w:t>Offered</w:t>
+      </w:r>
+      <w:proofErr w:type="spellEnd"/>
+      <w:r>
+        <w:t xml:space="preserve"> IP </w:t>
+      </w:r>
+      <w:proofErr w:type="spellStart"/>
+      <w:r>
+        <w:t>address</w:t>
+      </w:r>
+      <w:proofErr w:type="spellEnd"/>
+    </w:p>
+    <w:p>
+      <w:pPr>
+        <w:pStyle w:val="ListParagraph"/>
+        <w:numPr>
+          <w:ilvl w:val="0"/>
+          <w:numId w:val="10"/>
+        </w:numPr>
+      </w:pPr>
+      <w:proofErr w:type="spellStart"/>
+      <w:r>
+        <w:t>Subnet</w:t>
+      </w:r>
+      <w:proofErr w:type="spellEnd"/>
+      <w:r>
+        <w:t xml:space="preserve"> </w:t>
+      </w:r>
+      <w:proofErr w:type="spellStart"/>
+      <w:r>
+        <w:t>Mask</w:t>
+      </w:r>
+      <w:proofErr w:type="spellEnd"/>
+    </w:p>
+    <w:p>
+      <w:pPr>
+        <w:pStyle w:val="ListParagraph"/>
+        <w:numPr>
+          <w:ilvl w:val="0"/>
+          <w:numId w:val="10"/>
+        </w:numPr>
+      </w:pPr>
+      <w:proofErr w:type="spellStart"/>
+      <w:r>
+        <w:t>Lease</w:t>
+      </w:r>
+      <w:proofErr w:type="spellEnd"/>
+      <w:r>
+        <w:t xml:space="preserve"> </w:t>
+      </w:r>
+      <w:proofErr w:type="spellStart"/>
+      <w:r>
+        <w:t>timeframe</w:t>
+      </w:r>
+      <w:proofErr w:type="spellEnd"/>
+    </w:p>
+    <w:p>
+      <w:pPr>
+        <w:pStyle w:val="ListParagraph"/>
+        <w:numPr>
+          <w:ilvl w:val="0"/>
+          <w:numId w:val="10"/>
+        </w:numPr>
+      </w:pPr>
+      <w:r>
+        <w:t xml:space="preserve">DHCP Server </w:t>
+      </w:r>
+      <w:proofErr w:type="spellStart"/>
+      <w:r>
+        <w:t>address</w:t>
+      </w:r>
+      <w:proofErr w:type="spellEnd"/>
+    </w:p>
+    <w:p>
+      <w:pPr>
+        <w:pStyle w:val="ListParagraph"/>
+        <w:numPr>
+          <w:ilvl w:val="0"/>
+          <w:numId w:val="10"/>
+        </w:numPr>
+      </w:pPr>
+      <w:r>
+        <w:t>MAC addres</w:t>
+      </w:r>
+      <w:proofErr w:type="spellStart"/>
+      <w:r>
+        <w:t>s</w:t>
+      </w:r>
+      <w:proofErr w:type="spellEnd"/>
+      <w:r>
+        <w:t xml:space="preserve"> of </w:t>
+      </w:r>
+      <w:proofErr w:type="spellStart"/>
+      <w:r>
+        <w:t>the</w:t>
+      </w:r>
+      <w:proofErr w:type="spellEnd"/>
+      <w:r>
+        <w:t xml:space="preserve"> </w:t>
+      </w:r>
+      <w:proofErr w:type="spellStart"/>
+      <w:r>
+        <w:t>device</w:t>
+      </w:r>
+      <w:proofErr w:type="spellEnd"/>
+      <w:r>
+        <w:t xml:space="preserve"> </w:t>
+      </w:r>
+      <w:proofErr w:type="spellStart"/>
+      <w:r>
+        <w:t>that</w:t>
+      </w:r>
+      <w:proofErr w:type="spellEnd"/>
+      <w:r>
+        <w:t xml:space="preserve"> </w:t>
+      </w:r>
+      <w:proofErr w:type="spellStart"/>
+      <w:r>
+        <w:t>requested</w:t>
+      </w:r>
+      <w:proofErr w:type="spellEnd"/>
+      <w:r>
+        <w:t xml:space="preserve"> an IP</w:t>
+      </w:r>
+    </w:p>
+    <w:p>
+      <w:pPr>
+        <w:pStyle w:val="Heading3"/>
+      </w:pPr>
+      <w:proofErr w:type="spellStart"/>
+      <w:r>
+        <w:t>Request</w:t>
+      </w:r>
+      <w:proofErr w:type="spellEnd"/>
+    </w:p>
+    <w:p>
+      <w:proofErr w:type="spellStart"/>
+      <w:r>
+        <w:t>F</w:t>
+      </w:r>
+      <w:r>
+        <w:t>rom</w:t>
+      </w:r>
+      <w:proofErr w:type="spellEnd"/>
+      <w:r>
+        <w:t xml:space="preserve"> 0.0.0.0 </w:t>
+      </w:r>
+      <w:proofErr w:type="spellStart"/>
+      <w:r>
+        <w:t>to</w:t>
+      </w:r>
+      <w:proofErr w:type="spellEnd"/>
+      <w:r>
+        <w:t xml:space="preserve"> 255.255.255.255 </w:t>
+      </w:r>
+      <w:proofErr w:type="spellStart"/>
+      <w:r>
+        <w:t>or</w:t>
+      </w:r>
+      <w:proofErr w:type="spellEnd"/>
+      <w:r>
+        <w:t xml:space="preserve"> </w:t>
+      </w:r>
+      <w:proofErr w:type="spellStart"/>
+      <w:r>
+        <w:t>to</w:t>
+      </w:r>
+      <w:proofErr w:type="spellEnd"/>
+      <w:r>
+        <w:t xml:space="preserve"> </w:t>
+      </w:r>
+      <w:proofErr w:type="spellStart"/>
+      <w:r>
+        <w:t>the</w:t>
+      </w:r>
+      <w:proofErr w:type="spellEnd"/>
+      <w:r>
+        <w:t xml:space="preserve"> DHCP server </w:t>
+      </w:r>
+      <w:proofErr w:type="spellStart"/>
+      <w:r>
+        <w:t>address</w:t>
+      </w:r>
+      <w:proofErr w:type="spellEnd"/>
+      <w:r>
+        <w:t xml:space="preserve"> </w:t>
+      </w:r>
+      <w:proofErr w:type="spellStart"/>
+      <w:r>
+        <w:t>message</w:t>
+      </w:r>
+      <w:proofErr w:type="spellEnd"/>
+      <w:r>
+        <w:t xml:space="preserve"> </w:t>
+      </w:r>
+      <w:proofErr w:type="spellStart"/>
+      <w:r>
+        <w:t>contents</w:t>
+      </w:r>
+      <w:proofErr w:type="spellEnd"/>
+    </w:p>
+    <w:p>
+      <w:pPr>
+        <w:pStyle w:val="ListParagraph"/>
+        <w:numPr>
+          <w:ilvl w:val="0"/>
+          <w:numId w:val="10"/>
+        </w:numPr>
+      </w:pPr>
+      <w:r>
+        <w:t xml:space="preserve">The </w:t>
+      </w:r>
+      <w:proofErr w:type="spellStart"/>
+      <w:r>
+        <w:t>Endpoint</w:t>
+      </w:r>
+      <w:proofErr w:type="spellEnd"/>
+      <w:r>
+        <w:t xml:space="preserve"> </w:t>
+      </w:r>
+      <w:proofErr w:type="spellStart"/>
+      <w:r>
+        <w:t>requests</w:t>
+      </w:r>
+      <w:proofErr w:type="spellEnd"/>
+      <w:r>
+        <w:t xml:space="preserve"> </w:t>
+      </w:r>
+      <w:proofErr w:type="spellStart"/>
+      <w:r>
+        <w:t>one</w:t>
+      </w:r>
+      <w:proofErr w:type="spellEnd"/>
+      <w:r>
+        <w:t xml:space="preserve"> of </w:t>
+      </w:r>
+      <w:proofErr w:type="spellStart"/>
+      <w:r>
+        <w:t>the</w:t>
+      </w:r>
+      <w:proofErr w:type="spellEnd"/>
+      <w:r>
+        <w:t xml:space="preserve"> </w:t>
+      </w:r>
+      <w:proofErr w:type="spellStart"/>
+      <w:r>
+        <w:t>offers</w:t>
+      </w:r>
+      <w:proofErr w:type="spellEnd"/>
+      <w:r>
+        <w:t xml:space="preserve"> </w:t>
+      </w:r>
+      <w:proofErr w:type="spellStart"/>
+      <w:r>
+        <w:t>to</w:t>
+      </w:r>
+      <w:proofErr w:type="spellEnd"/>
+      <w:r>
+        <w:t xml:space="preserve"> be </w:t>
+      </w:r>
+      <w:proofErr w:type="spellStart"/>
+      <w:r>
+        <w:t>assigned</w:t>
+      </w:r>
+      <w:proofErr w:type="spellEnd"/>
+      <w:r>
+        <w:t xml:space="preserve"> </w:t>
+      </w:r>
+      <w:proofErr w:type="spellStart"/>
+      <w:r>
+        <w:t>to</w:t>
+      </w:r>
+      <w:proofErr w:type="spellEnd"/>
+      <w:r>
+        <w:t xml:space="preserve"> </w:t>
+      </w:r>
+      <w:proofErr w:type="spellStart"/>
+      <w:r>
+        <w:t>them</w:t>
+      </w:r>
+      <w:proofErr w:type="spellEnd"/>
+    </w:p>
+    <w:p>
+      <w:pPr>
+        <w:pStyle w:val="ListParagraph"/>
+        <w:numPr>
+          <w:ilvl w:val="0"/>
+          <w:numId w:val="10"/>
+        </w:numPr>
+      </w:pPr>
+      <w:proofErr w:type="spellStart"/>
+      <w:r>
+        <w:t>Transaction</w:t>
+      </w:r>
+      <w:proofErr w:type="spellEnd"/>
+      <w:r>
+        <w:t xml:space="preserve"> ID (</w:t>
+      </w:r>
+      <w:proofErr w:type="spellStart"/>
+      <w:r>
+        <w:t>which</w:t>
+      </w:r>
+      <w:proofErr w:type="spellEnd"/>
+      <w:r>
+        <w:t xml:space="preserve"> DHCP server </w:t>
+      </w:r>
+      <w:proofErr w:type="spellStart"/>
+      <w:r>
+        <w:t>gave</w:t>
+      </w:r>
+      <w:proofErr w:type="spellEnd"/>
+      <w:r>
+        <w:t xml:space="preserve"> </w:t>
+      </w:r>
+      <w:proofErr w:type="spellStart"/>
+      <w:r>
+        <w:t>the</w:t>
+      </w:r>
+      <w:proofErr w:type="spellEnd"/>
+      <w:r>
+        <w:t xml:space="preserve"> </w:t>
+      </w:r>
+      <w:proofErr w:type="spellStart"/>
+      <w:r>
+        <w:t>offer</w:t>
+      </w:r>
+      <w:proofErr w:type="spellEnd"/>
+      <w:r>
+        <w:t>)</w:t>
+      </w:r>
+    </w:p>
+    <w:p>
+      <w:pPr>
+        <w:pStyle w:val="ListParagraph"/>
+        <w:numPr>
+          <w:ilvl w:val="0"/>
+          <w:numId w:val="10"/>
+        </w:numPr>
+      </w:pPr>
+      <w:proofErr w:type="spellStart"/>
+      <w:r>
+        <w:t>Requested</w:t>
+      </w:r>
+      <w:proofErr w:type="spellEnd"/>
+      <w:r>
+        <w:t xml:space="preserve"> IP</w:t>
+      </w:r>
+    </w:p>
+    <w:p>
+      <w:pPr>
+        <w:pStyle w:val="ListParagraph"/>
+        <w:numPr>
+          <w:ilvl w:val="0"/>
+          <w:numId w:val="10"/>
+        </w:numPr>
+      </w:pPr>
+      <w:r>
+        <w:t xml:space="preserve">DHCP Server </w:t>
+      </w:r>
+      <w:proofErr w:type="spellStart"/>
+      <w:r>
+        <w:t>address</w:t>
+      </w:r>
+      <w:proofErr w:type="spellEnd"/>
+    </w:p>
+    <w:p/>
+    <w:p>
+      <w:pPr>
+        <w:pStyle w:val="Heading3"/>
+      </w:pPr>
+      <w:proofErr w:type="spellStart"/>
+      <w:r>
+        <w:lastRenderedPageBreak/>
+        <w:t>Acknowledge</w:t>
+      </w:r>
+      <w:proofErr w:type="spellEnd"/>
+    </w:p>
+    <w:p>
+      <w:proofErr w:type="spellStart"/>
+      <w:r>
+        <w:t>From</w:t>
+      </w:r>
+      <w:proofErr w:type="spellEnd"/>
+      <w:r>
+        <w:t xml:space="preserve"> DHCP server </w:t>
+      </w:r>
+      <w:proofErr w:type="spellStart"/>
+      <w:r>
+        <w:t>address</w:t>
+      </w:r>
+      <w:proofErr w:type="spellEnd"/>
+      <w:r>
+        <w:t xml:space="preserve"> </w:t>
+      </w:r>
+      <w:proofErr w:type="spellStart"/>
+      <w:r>
+        <w:t>to</w:t>
+      </w:r>
+      <w:proofErr w:type="spellEnd"/>
+      <w:r>
+        <w:t xml:space="preserve"> </w:t>
+      </w:r>
+      <w:proofErr w:type="spellStart"/>
+      <w:r>
+        <w:t>broadcast</w:t>
+      </w:r>
+      <w:proofErr w:type="spellEnd"/>
+    </w:p>
+    <w:p>
+      <w:proofErr w:type="spellStart"/>
+      <w:r>
+        <w:t>Message</w:t>
+      </w:r>
+      <w:proofErr w:type="spellEnd"/>
+      <w:r>
+        <w:t xml:space="preserve"> </w:t>
+      </w:r>
+      <w:proofErr w:type="spellStart"/>
+      <w:r>
+        <w:t>contents</w:t>
+      </w:r>
+      <w:proofErr w:type="spellEnd"/>
+    </w:p>
+    <w:p>
+      <w:pPr>
+        <w:pStyle w:val="ListParagraph"/>
+        <w:numPr>
+          <w:ilvl w:val="0"/>
+          <w:numId w:val="11"/>
+        </w:numPr>
+      </w:pPr>
+      <w:proofErr w:type="spellStart"/>
+      <w:r>
+        <w:t>the</w:t>
+      </w:r>
+      <w:proofErr w:type="spellEnd"/>
+      <w:r>
+        <w:t xml:space="preserve"> </w:t>
+      </w:r>
+      <w:proofErr w:type="spellStart"/>
+      <w:r>
+        <w:t>distributed</w:t>
+      </w:r>
+      <w:proofErr w:type="spellEnd"/>
+      <w:r>
+        <w:t xml:space="preserve"> IP</w:t>
+      </w:r>
+    </w:p>
+    <w:p>
+      <w:pPr>
+        <w:pStyle w:val="ListParagraph"/>
+        <w:numPr>
+          <w:ilvl w:val="0"/>
+          <w:numId w:val="11"/>
+        </w:numPr>
+      </w:pPr>
+      <w:proofErr w:type="spellStart"/>
+      <w:r>
+        <w:t>subnet</w:t>
+      </w:r>
+      <w:proofErr w:type="spellEnd"/>
+      <w:r>
+        <w:t xml:space="preserve"> </w:t>
+      </w:r>
+      <w:proofErr w:type="spellStart"/>
+      <w:r>
+        <w:t>mask</w:t>
+      </w:r>
+      <w:proofErr w:type="spellEnd"/>
+    </w:p>
+    <w:p>
+      <w:pPr>
+        <w:pStyle w:val="ListParagraph"/>
+        <w:numPr>
+          <w:ilvl w:val="0"/>
+          <w:numId w:val="11"/>
+        </w:numPr>
+      </w:pPr>
+      <w:proofErr w:type="spellStart"/>
+      <w:r>
+        <w:t>lease</w:t>
+      </w:r>
+      <w:proofErr w:type="spellEnd"/>
+      <w:r>
+        <w:t xml:space="preserve"> </w:t>
+      </w:r>
+      <w:proofErr w:type="spellStart"/>
+      <w:r>
+        <w:t>timeframe</w:t>
       </w:r>
       <w:proofErr w:type="spellEnd"/>
     </w:p>
@@ -37,6 +1418,1207 @@
     </w:sectPr>
   </w:body>
 </w:document>
+</file>
+
+<file path=word/numbering.xml><?xml version="1.0" encoding="utf-8"?>
+<w:numbering xmlns:wpc="http://schemas.microsoft.com/office/word/2010/wordprocessingCanvas" xmlns:cx="http://schemas.microsoft.com/office/drawing/2014/chartex" xmlns:cx1="http://schemas.microsoft.com/office/drawing/2015/9/8/chartex" xmlns:cx2="http://schemas.microsoft.com/office/drawing/2015/10/21/chartex" xmlns:cx3="http://schemas.microsoft.com/office/drawing/2016/5/9/chartex" xmlns:cx4="http://schemas.microsoft.com/office/drawing/2016/5/10/chartex" xmlns:cx5="http://schemas.microsoft.com/office/drawing/2016/5/11/chartex" xmlns:cx6="http://schemas.microsoft.com/office/drawing/2016/5/12/chartex" xmlns:cx7="http://schemas.microsoft.com/office/drawing/2016/5/13/chartex" xmlns:cx8="http://schemas.microsoft.com/office/drawing/2016/5/14/chartex" xmlns:mc="http://schemas.openxmlformats.org/markup-compatibility/2006" xmlns:aink="http://schemas.microsoft.com/office/drawing/2016/ink" xmlns:am3d="http://schemas.microsoft.com/office/drawing/2017/model3d" xmlns:o="urn:schemas-microsoft-com:office:office" xmlns:oel="http://schemas.microsoft.com/office/2019/extlst" xmlns:r="http://schemas.openxmlformats.org/officeDocument/2006/relationships" xmlns:m="http://schemas.openxmlformats.org/officeDocument/2006/math" xmlns:v="urn:schemas-microsoft-com:vml" xmlns:wp14="http://schemas.microsoft.com/office/word/2010/wordprocessingDrawing" xmlns:wp="http://schemas.openxmlformats.org/drawingml/2006/wordprocessingDrawing" xmlns:w10="urn:schemas-microsoft-com:office:word" xmlns:w="http://schemas.openxmlformats.org/wordprocessingml/2006/main" xmlns:w14="http://schemas.microsoft.com/office/word/2010/wordml" xmlns:w15="http://schemas.microsoft.com/office/word/2012/wordml" xmlns:w16cex="http://schemas.microsoft.com/office/word/2018/wordml/cex" xmlns:w16cid="http://schemas.microsoft.com/office/word/2016/wordml/cid" xmlns:w16="http://schemas.microsoft.com/office/word/2018/wordml" xmlns:w16du="http://schemas.microsoft.com/office/word/2023/wordml/word16du" xmlns:w16sdtdh="http://schemas.microsoft.com/office/word/2020/wordml/sdtdatahash" xmlns:w16sdtfl="http://schemas.microsoft.com/office/word/2024/wordml/sdtformatlock" xmlns:w16se="http://schemas.microsoft.com/office/word/2015/wordml/symex" xmlns:wpg="http://schemas.microsoft.com/office/word/2010/wordprocessingGroup" xmlns:wpi="http://schemas.microsoft.com/office/word/2010/wordprocessingInk" xmlns:wne="http://schemas.microsoft.com/office/word/2006/wordml" xmlns:wps="http://schemas.microsoft.com/office/word/2010/wordprocessingShape" mc:Ignorable="w14 w15 w16se w16cid w16 w16cex w16sdtdh w16sdtfl w16du wp14">
+  <w:abstractNum w:abstractNumId="0" w15:restartNumberingAfterBreak="0">
+    <w:nsid w:val="0A173473"/>
+    <w:multiLevelType w:val="hybridMultilevel"/>
+    <w:tmpl w:val="DFA2F0A2"/>
+    <w:lvl w:ilvl="0" w:tplc="4DDC3FBC">
+      <w:numFmt w:val="bullet"/>
+      <w:lvlText w:val="-"/>
+      <w:lvlJc w:val="left"/>
+      <w:pPr>
+        <w:ind w:left="720" w:hanging="360"/>
+      </w:pPr>
+      <w:rPr>
+        <w:rFonts w:ascii="Calibri" w:eastAsiaTheme="minorHAnsi" w:hAnsi="Calibri" w:cs="Calibri" w:hint="default"/>
+      </w:rPr>
+    </w:lvl>
+    <w:lvl w:ilvl="1" w:tplc="040E0003" w:tentative="1">
+      <w:start w:val="1"/>
+      <w:numFmt w:val="bullet"/>
+      <w:lvlText w:val="o"/>
+      <w:lvlJc w:val="left"/>
+      <w:pPr>
+        <w:ind w:left="1440" w:hanging="360"/>
+      </w:pPr>
+      <w:rPr>
+        <w:rFonts w:ascii="Courier New" w:hAnsi="Courier New" w:cs="Courier New" w:hint="default"/>
+      </w:rPr>
+    </w:lvl>
+    <w:lvl w:ilvl="2" w:tplc="040E0005" w:tentative="1">
+      <w:start w:val="1"/>
+      <w:numFmt w:val="bullet"/>
+      <w:lvlText w:val=""/>
+      <w:lvlJc w:val="left"/>
+      <w:pPr>
+        <w:ind w:left="2160" w:hanging="360"/>
+      </w:pPr>
+      <w:rPr>
+        <w:rFonts w:ascii="Wingdings" w:hAnsi="Wingdings" w:hint="default"/>
+      </w:rPr>
+    </w:lvl>
+    <w:lvl w:ilvl="3" w:tplc="040E0001" w:tentative="1">
+      <w:start w:val="1"/>
+      <w:numFmt w:val="bullet"/>
+      <w:lvlText w:val=""/>
+      <w:lvlJc w:val="left"/>
+      <w:pPr>
+        <w:ind w:left="2880" w:hanging="360"/>
+      </w:pPr>
+      <w:rPr>
+        <w:rFonts w:ascii="Symbol" w:hAnsi="Symbol" w:hint="default"/>
+      </w:rPr>
+    </w:lvl>
+    <w:lvl w:ilvl="4" w:tplc="040E0003" w:tentative="1">
+      <w:start w:val="1"/>
+      <w:numFmt w:val="bullet"/>
+      <w:lvlText w:val="o"/>
+      <w:lvlJc w:val="left"/>
+      <w:pPr>
+        <w:ind w:left="3600" w:hanging="360"/>
+      </w:pPr>
+      <w:rPr>
+        <w:rFonts w:ascii="Courier New" w:hAnsi="Courier New" w:cs="Courier New" w:hint="default"/>
+      </w:rPr>
+    </w:lvl>
+    <w:lvl w:ilvl="5" w:tplc="040E0005" w:tentative="1">
+      <w:start w:val="1"/>
+      <w:numFmt w:val="bullet"/>
+      <w:lvlText w:val=""/>
+      <w:lvlJc w:val="left"/>
+      <w:pPr>
+        <w:ind w:left="4320" w:hanging="360"/>
+      </w:pPr>
+      <w:rPr>
+        <w:rFonts w:ascii="Wingdings" w:hAnsi="Wingdings" w:hint="default"/>
+      </w:rPr>
+    </w:lvl>
+    <w:lvl w:ilvl="6" w:tplc="040E0001" w:tentative="1">
+      <w:start w:val="1"/>
+      <w:numFmt w:val="bullet"/>
+      <w:lvlText w:val=""/>
+      <w:lvlJc w:val="left"/>
+      <w:pPr>
+        <w:ind w:left="5040" w:hanging="360"/>
+      </w:pPr>
+      <w:rPr>
+        <w:rFonts w:ascii="Symbol" w:hAnsi="Symbol" w:hint="default"/>
+      </w:rPr>
+    </w:lvl>
+    <w:lvl w:ilvl="7" w:tplc="040E0003" w:tentative="1">
+      <w:start w:val="1"/>
+      <w:numFmt w:val="bullet"/>
+      <w:lvlText w:val="o"/>
+      <w:lvlJc w:val="left"/>
+      <w:pPr>
+        <w:ind w:left="5760" w:hanging="360"/>
+      </w:pPr>
+      <w:rPr>
+        <w:rFonts w:ascii="Courier New" w:hAnsi="Courier New" w:cs="Courier New" w:hint="default"/>
+      </w:rPr>
+    </w:lvl>
+    <w:lvl w:ilvl="8" w:tplc="040E0005" w:tentative="1">
+      <w:start w:val="1"/>
+      <w:numFmt w:val="bullet"/>
+      <w:lvlText w:val=""/>
+      <w:lvlJc w:val="left"/>
+      <w:pPr>
+        <w:ind w:left="6480" w:hanging="360"/>
+      </w:pPr>
+      <w:rPr>
+        <w:rFonts w:ascii="Wingdings" w:hAnsi="Wingdings" w:hint="default"/>
+      </w:rPr>
+    </w:lvl>
+  </w:abstractNum>
+  <w:abstractNum w:abstractNumId="1" w15:restartNumberingAfterBreak="0">
+    <w:nsid w:val="134F745B"/>
+    <w:multiLevelType w:val="hybridMultilevel"/>
+    <w:tmpl w:val="1F20859E"/>
+    <w:lvl w:ilvl="0" w:tplc="040E000F">
+      <w:start w:val="1"/>
+      <w:numFmt w:val="decimal"/>
+      <w:lvlText w:val="%1."/>
+      <w:lvlJc w:val="left"/>
+      <w:pPr>
+        <w:ind w:left="720" w:hanging="360"/>
+      </w:pPr>
+      <w:rPr>
+        <w:rFonts w:hint="default"/>
+      </w:rPr>
+    </w:lvl>
+    <w:lvl w:ilvl="1" w:tplc="040E0019" w:tentative="1">
+      <w:start w:val="1"/>
+      <w:numFmt w:val="lowerLetter"/>
+      <w:lvlText w:val="%2."/>
+      <w:lvlJc w:val="left"/>
+      <w:pPr>
+        <w:ind w:left="1440" w:hanging="360"/>
+      </w:pPr>
+    </w:lvl>
+    <w:lvl w:ilvl="2" w:tplc="040E001B" w:tentative="1">
+      <w:start w:val="1"/>
+      <w:numFmt w:val="lowerRoman"/>
+      <w:lvlText w:val="%3."/>
+      <w:lvlJc w:val="right"/>
+      <w:pPr>
+        <w:ind w:left="2160" w:hanging="180"/>
+      </w:pPr>
+    </w:lvl>
+    <w:lvl w:ilvl="3" w:tplc="040E000F" w:tentative="1">
+      <w:start w:val="1"/>
+      <w:numFmt w:val="decimal"/>
+      <w:lvlText w:val="%4."/>
+      <w:lvlJc w:val="left"/>
+      <w:pPr>
+        <w:ind w:left="2880" w:hanging="360"/>
+      </w:pPr>
+    </w:lvl>
+    <w:lvl w:ilvl="4" w:tplc="040E0019" w:tentative="1">
+      <w:start w:val="1"/>
+      <w:numFmt w:val="lowerLetter"/>
+      <w:lvlText w:val="%5."/>
+      <w:lvlJc w:val="left"/>
+      <w:pPr>
+        <w:ind w:left="3600" w:hanging="360"/>
+      </w:pPr>
+    </w:lvl>
+    <w:lvl w:ilvl="5" w:tplc="040E001B" w:tentative="1">
+      <w:start w:val="1"/>
+      <w:numFmt w:val="lowerRoman"/>
+      <w:lvlText w:val="%6."/>
+      <w:lvlJc w:val="right"/>
+      <w:pPr>
+        <w:ind w:left="4320" w:hanging="180"/>
+      </w:pPr>
+    </w:lvl>
+    <w:lvl w:ilvl="6" w:tplc="040E000F" w:tentative="1">
+      <w:start w:val="1"/>
+      <w:numFmt w:val="decimal"/>
+      <w:lvlText w:val="%7."/>
+      <w:lvlJc w:val="left"/>
+      <w:pPr>
+        <w:ind w:left="5040" w:hanging="360"/>
+      </w:pPr>
+    </w:lvl>
+    <w:lvl w:ilvl="7" w:tplc="040E0019" w:tentative="1">
+      <w:start w:val="1"/>
+      <w:numFmt w:val="lowerLetter"/>
+      <w:lvlText w:val="%8."/>
+      <w:lvlJc w:val="left"/>
+      <w:pPr>
+        <w:ind w:left="5760" w:hanging="360"/>
+      </w:pPr>
+    </w:lvl>
+    <w:lvl w:ilvl="8" w:tplc="040E001B" w:tentative="1">
+      <w:start w:val="1"/>
+      <w:numFmt w:val="lowerRoman"/>
+      <w:lvlText w:val="%9."/>
+      <w:lvlJc w:val="right"/>
+      <w:pPr>
+        <w:ind w:left="6480" w:hanging="180"/>
+      </w:pPr>
+    </w:lvl>
+  </w:abstractNum>
+  <w:abstractNum w:abstractNumId="2" w15:restartNumberingAfterBreak="0">
+    <w:nsid w:val="1D2001A4"/>
+    <w:multiLevelType w:val="hybridMultilevel"/>
+    <w:tmpl w:val="2946E69A"/>
+    <w:lvl w:ilvl="0" w:tplc="4DDC3FBC">
+      <w:numFmt w:val="bullet"/>
+      <w:lvlText w:val="-"/>
+      <w:lvlJc w:val="left"/>
+      <w:pPr>
+        <w:ind w:left="720" w:hanging="360"/>
+      </w:pPr>
+      <w:rPr>
+        <w:rFonts w:ascii="Calibri" w:eastAsiaTheme="minorHAnsi" w:hAnsi="Calibri" w:cs="Calibri" w:hint="default"/>
+      </w:rPr>
+    </w:lvl>
+    <w:lvl w:ilvl="1" w:tplc="040E0003" w:tentative="1">
+      <w:start w:val="1"/>
+      <w:numFmt w:val="bullet"/>
+      <w:lvlText w:val="o"/>
+      <w:lvlJc w:val="left"/>
+      <w:pPr>
+        <w:ind w:left="1440" w:hanging="360"/>
+      </w:pPr>
+      <w:rPr>
+        <w:rFonts w:ascii="Courier New" w:hAnsi="Courier New" w:cs="Courier New" w:hint="default"/>
+      </w:rPr>
+    </w:lvl>
+    <w:lvl w:ilvl="2" w:tplc="040E0005" w:tentative="1">
+      <w:start w:val="1"/>
+      <w:numFmt w:val="bullet"/>
+      <w:lvlText w:val=""/>
+      <w:lvlJc w:val="left"/>
+      <w:pPr>
+        <w:ind w:left="2160" w:hanging="360"/>
+      </w:pPr>
+      <w:rPr>
+        <w:rFonts w:ascii="Wingdings" w:hAnsi="Wingdings" w:hint="default"/>
+      </w:rPr>
+    </w:lvl>
+    <w:lvl w:ilvl="3" w:tplc="040E0001" w:tentative="1">
+      <w:start w:val="1"/>
+      <w:numFmt w:val="bullet"/>
+      <w:lvlText w:val=""/>
+      <w:lvlJc w:val="left"/>
+      <w:pPr>
+        <w:ind w:left="2880" w:hanging="360"/>
+      </w:pPr>
+      <w:rPr>
+        <w:rFonts w:ascii="Symbol" w:hAnsi="Symbol" w:hint="default"/>
+      </w:rPr>
+    </w:lvl>
+    <w:lvl w:ilvl="4" w:tplc="040E0003" w:tentative="1">
+      <w:start w:val="1"/>
+      <w:numFmt w:val="bullet"/>
+      <w:lvlText w:val="o"/>
+      <w:lvlJc w:val="left"/>
+      <w:pPr>
+        <w:ind w:left="3600" w:hanging="360"/>
+      </w:pPr>
+      <w:rPr>
+        <w:rFonts w:ascii="Courier New" w:hAnsi="Courier New" w:cs="Courier New" w:hint="default"/>
+      </w:rPr>
+    </w:lvl>
+    <w:lvl w:ilvl="5" w:tplc="040E0005" w:tentative="1">
+      <w:start w:val="1"/>
+      <w:numFmt w:val="bullet"/>
+      <w:lvlText w:val=""/>
+      <w:lvlJc w:val="left"/>
+      <w:pPr>
+        <w:ind w:left="4320" w:hanging="360"/>
+      </w:pPr>
+      <w:rPr>
+        <w:rFonts w:ascii="Wingdings" w:hAnsi="Wingdings" w:hint="default"/>
+      </w:rPr>
+    </w:lvl>
+    <w:lvl w:ilvl="6" w:tplc="040E0001" w:tentative="1">
+      <w:start w:val="1"/>
+      <w:numFmt w:val="bullet"/>
+      <w:lvlText w:val=""/>
+      <w:lvlJc w:val="left"/>
+      <w:pPr>
+        <w:ind w:left="5040" w:hanging="360"/>
+      </w:pPr>
+      <w:rPr>
+        <w:rFonts w:ascii="Symbol" w:hAnsi="Symbol" w:hint="default"/>
+      </w:rPr>
+    </w:lvl>
+    <w:lvl w:ilvl="7" w:tplc="040E0003" w:tentative="1">
+      <w:start w:val="1"/>
+      <w:numFmt w:val="bullet"/>
+      <w:lvlText w:val="o"/>
+      <w:lvlJc w:val="left"/>
+      <w:pPr>
+        <w:ind w:left="5760" w:hanging="360"/>
+      </w:pPr>
+      <w:rPr>
+        <w:rFonts w:ascii="Courier New" w:hAnsi="Courier New" w:cs="Courier New" w:hint="default"/>
+      </w:rPr>
+    </w:lvl>
+    <w:lvl w:ilvl="8" w:tplc="040E0005" w:tentative="1">
+      <w:start w:val="1"/>
+      <w:numFmt w:val="bullet"/>
+      <w:lvlText w:val=""/>
+      <w:lvlJc w:val="left"/>
+      <w:pPr>
+        <w:ind w:left="6480" w:hanging="360"/>
+      </w:pPr>
+      <w:rPr>
+        <w:rFonts w:ascii="Wingdings" w:hAnsi="Wingdings" w:hint="default"/>
+      </w:rPr>
+    </w:lvl>
+  </w:abstractNum>
+  <w:abstractNum w:abstractNumId="3" w15:restartNumberingAfterBreak="0">
+    <w:nsid w:val="1F751416"/>
+    <w:multiLevelType w:val="hybridMultilevel"/>
+    <w:tmpl w:val="A3D837E8"/>
+    <w:lvl w:ilvl="0" w:tplc="4DDC3FBC">
+      <w:numFmt w:val="bullet"/>
+      <w:lvlText w:val="-"/>
+      <w:lvlJc w:val="left"/>
+      <w:pPr>
+        <w:ind w:left="720" w:hanging="360"/>
+      </w:pPr>
+      <w:rPr>
+        <w:rFonts w:ascii="Calibri" w:eastAsiaTheme="minorHAnsi" w:hAnsi="Calibri" w:cs="Calibri" w:hint="default"/>
+      </w:rPr>
+    </w:lvl>
+    <w:lvl w:ilvl="1" w:tplc="040E0003" w:tentative="1">
+      <w:start w:val="1"/>
+      <w:numFmt w:val="bullet"/>
+      <w:lvlText w:val="o"/>
+      <w:lvlJc w:val="left"/>
+      <w:pPr>
+        <w:ind w:left="1440" w:hanging="360"/>
+      </w:pPr>
+      <w:rPr>
+        <w:rFonts w:ascii="Courier New" w:hAnsi="Courier New" w:cs="Courier New" w:hint="default"/>
+      </w:rPr>
+    </w:lvl>
+    <w:lvl w:ilvl="2" w:tplc="040E0005" w:tentative="1">
+      <w:start w:val="1"/>
+      <w:numFmt w:val="bullet"/>
+      <w:lvlText w:val=""/>
+      <w:lvlJc w:val="left"/>
+      <w:pPr>
+        <w:ind w:left="2160" w:hanging="360"/>
+      </w:pPr>
+      <w:rPr>
+        <w:rFonts w:ascii="Wingdings" w:hAnsi="Wingdings" w:hint="default"/>
+      </w:rPr>
+    </w:lvl>
+    <w:lvl w:ilvl="3" w:tplc="040E0001" w:tentative="1">
+      <w:start w:val="1"/>
+      <w:numFmt w:val="bullet"/>
+      <w:lvlText w:val=""/>
+      <w:lvlJc w:val="left"/>
+      <w:pPr>
+        <w:ind w:left="2880" w:hanging="360"/>
+      </w:pPr>
+      <w:rPr>
+        <w:rFonts w:ascii="Symbol" w:hAnsi="Symbol" w:hint="default"/>
+      </w:rPr>
+    </w:lvl>
+    <w:lvl w:ilvl="4" w:tplc="040E0003" w:tentative="1">
+      <w:start w:val="1"/>
+      <w:numFmt w:val="bullet"/>
+      <w:lvlText w:val="o"/>
+      <w:lvlJc w:val="left"/>
+      <w:pPr>
+        <w:ind w:left="3600" w:hanging="360"/>
+      </w:pPr>
+      <w:rPr>
+        <w:rFonts w:ascii="Courier New" w:hAnsi="Courier New" w:cs="Courier New" w:hint="default"/>
+      </w:rPr>
+    </w:lvl>
+    <w:lvl w:ilvl="5" w:tplc="040E0005" w:tentative="1">
+      <w:start w:val="1"/>
+      <w:numFmt w:val="bullet"/>
+      <w:lvlText w:val=""/>
+      <w:lvlJc w:val="left"/>
+      <w:pPr>
+        <w:ind w:left="4320" w:hanging="360"/>
+      </w:pPr>
+      <w:rPr>
+        <w:rFonts w:ascii="Wingdings" w:hAnsi="Wingdings" w:hint="default"/>
+      </w:rPr>
+    </w:lvl>
+    <w:lvl w:ilvl="6" w:tplc="040E0001" w:tentative="1">
+      <w:start w:val="1"/>
+      <w:numFmt w:val="bullet"/>
+      <w:lvlText w:val=""/>
+      <w:lvlJc w:val="left"/>
+      <w:pPr>
+        <w:ind w:left="5040" w:hanging="360"/>
+      </w:pPr>
+      <w:rPr>
+        <w:rFonts w:ascii="Symbol" w:hAnsi="Symbol" w:hint="default"/>
+      </w:rPr>
+    </w:lvl>
+    <w:lvl w:ilvl="7" w:tplc="040E0003" w:tentative="1">
+      <w:start w:val="1"/>
+      <w:numFmt w:val="bullet"/>
+      <w:lvlText w:val="o"/>
+      <w:lvlJc w:val="left"/>
+      <w:pPr>
+        <w:ind w:left="5760" w:hanging="360"/>
+      </w:pPr>
+      <w:rPr>
+        <w:rFonts w:ascii="Courier New" w:hAnsi="Courier New" w:cs="Courier New" w:hint="default"/>
+      </w:rPr>
+    </w:lvl>
+    <w:lvl w:ilvl="8" w:tplc="040E0005" w:tentative="1">
+      <w:start w:val="1"/>
+      <w:numFmt w:val="bullet"/>
+      <w:lvlText w:val=""/>
+      <w:lvlJc w:val="left"/>
+      <w:pPr>
+        <w:ind w:left="6480" w:hanging="360"/>
+      </w:pPr>
+      <w:rPr>
+        <w:rFonts w:ascii="Wingdings" w:hAnsi="Wingdings" w:hint="default"/>
+      </w:rPr>
+    </w:lvl>
+  </w:abstractNum>
+  <w:abstractNum w:abstractNumId="4" w15:restartNumberingAfterBreak="0">
+    <w:nsid w:val="3B351C97"/>
+    <w:multiLevelType w:val="hybridMultilevel"/>
+    <w:tmpl w:val="1E6EDC32"/>
+    <w:lvl w:ilvl="0" w:tplc="4DDC3FBC">
+      <w:numFmt w:val="bullet"/>
+      <w:lvlText w:val="-"/>
+      <w:lvlJc w:val="left"/>
+      <w:pPr>
+        <w:ind w:left="720" w:hanging="360"/>
+      </w:pPr>
+      <w:rPr>
+        <w:rFonts w:ascii="Calibri" w:eastAsiaTheme="minorHAnsi" w:hAnsi="Calibri" w:cs="Calibri" w:hint="default"/>
+      </w:rPr>
+    </w:lvl>
+    <w:lvl w:ilvl="1" w:tplc="040E0003" w:tentative="1">
+      <w:start w:val="1"/>
+      <w:numFmt w:val="bullet"/>
+      <w:lvlText w:val="o"/>
+      <w:lvlJc w:val="left"/>
+      <w:pPr>
+        <w:ind w:left="1440" w:hanging="360"/>
+      </w:pPr>
+      <w:rPr>
+        <w:rFonts w:ascii="Courier New" w:hAnsi="Courier New" w:cs="Courier New" w:hint="default"/>
+      </w:rPr>
+    </w:lvl>
+    <w:lvl w:ilvl="2" w:tplc="040E0005" w:tentative="1">
+      <w:start w:val="1"/>
+      <w:numFmt w:val="bullet"/>
+      <w:lvlText w:val=""/>
+      <w:lvlJc w:val="left"/>
+      <w:pPr>
+        <w:ind w:left="2160" w:hanging="360"/>
+      </w:pPr>
+      <w:rPr>
+        <w:rFonts w:ascii="Wingdings" w:hAnsi="Wingdings" w:hint="default"/>
+      </w:rPr>
+    </w:lvl>
+    <w:lvl w:ilvl="3" w:tplc="040E0001" w:tentative="1">
+      <w:start w:val="1"/>
+      <w:numFmt w:val="bullet"/>
+      <w:lvlText w:val=""/>
+      <w:lvlJc w:val="left"/>
+      <w:pPr>
+        <w:ind w:left="2880" w:hanging="360"/>
+      </w:pPr>
+      <w:rPr>
+        <w:rFonts w:ascii="Symbol" w:hAnsi="Symbol" w:hint="default"/>
+      </w:rPr>
+    </w:lvl>
+    <w:lvl w:ilvl="4" w:tplc="040E0003" w:tentative="1">
+      <w:start w:val="1"/>
+      <w:numFmt w:val="bullet"/>
+      <w:lvlText w:val="o"/>
+      <w:lvlJc w:val="left"/>
+      <w:pPr>
+        <w:ind w:left="3600" w:hanging="360"/>
+      </w:pPr>
+      <w:rPr>
+        <w:rFonts w:ascii="Courier New" w:hAnsi="Courier New" w:cs="Courier New" w:hint="default"/>
+      </w:rPr>
+    </w:lvl>
+    <w:lvl w:ilvl="5" w:tplc="040E0005" w:tentative="1">
+      <w:start w:val="1"/>
+      <w:numFmt w:val="bullet"/>
+      <w:lvlText w:val=""/>
+      <w:lvlJc w:val="left"/>
+      <w:pPr>
+        <w:ind w:left="4320" w:hanging="360"/>
+      </w:pPr>
+      <w:rPr>
+        <w:rFonts w:ascii="Wingdings" w:hAnsi="Wingdings" w:hint="default"/>
+      </w:rPr>
+    </w:lvl>
+    <w:lvl w:ilvl="6" w:tplc="040E0001" w:tentative="1">
+      <w:start w:val="1"/>
+      <w:numFmt w:val="bullet"/>
+      <w:lvlText w:val=""/>
+      <w:lvlJc w:val="left"/>
+      <w:pPr>
+        <w:ind w:left="5040" w:hanging="360"/>
+      </w:pPr>
+      <w:rPr>
+        <w:rFonts w:ascii="Symbol" w:hAnsi="Symbol" w:hint="default"/>
+      </w:rPr>
+    </w:lvl>
+    <w:lvl w:ilvl="7" w:tplc="040E0003" w:tentative="1">
+      <w:start w:val="1"/>
+      <w:numFmt w:val="bullet"/>
+      <w:lvlText w:val="o"/>
+      <w:lvlJc w:val="left"/>
+      <w:pPr>
+        <w:ind w:left="5760" w:hanging="360"/>
+      </w:pPr>
+      <w:rPr>
+        <w:rFonts w:ascii="Courier New" w:hAnsi="Courier New" w:cs="Courier New" w:hint="default"/>
+      </w:rPr>
+    </w:lvl>
+    <w:lvl w:ilvl="8" w:tplc="040E0005" w:tentative="1">
+      <w:start w:val="1"/>
+      <w:numFmt w:val="bullet"/>
+      <w:lvlText w:val=""/>
+      <w:lvlJc w:val="left"/>
+      <w:pPr>
+        <w:ind w:left="6480" w:hanging="360"/>
+      </w:pPr>
+      <w:rPr>
+        <w:rFonts w:ascii="Wingdings" w:hAnsi="Wingdings" w:hint="default"/>
+      </w:rPr>
+    </w:lvl>
+  </w:abstractNum>
+  <w:abstractNum w:abstractNumId="5" w15:restartNumberingAfterBreak="0">
+    <w:nsid w:val="41797BE4"/>
+    <w:multiLevelType w:val="hybridMultilevel"/>
+    <w:tmpl w:val="73CA7EDC"/>
+    <w:lvl w:ilvl="0" w:tplc="4DDC3FBC">
+      <w:numFmt w:val="bullet"/>
+      <w:lvlText w:val="-"/>
+      <w:lvlJc w:val="left"/>
+      <w:pPr>
+        <w:ind w:left="720" w:hanging="360"/>
+      </w:pPr>
+      <w:rPr>
+        <w:rFonts w:ascii="Calibri" w:eastAsiaTheme="minorHAnsi" w:hAnsi="Calibri" w:cs="Calibri" w:hint="default"/>
+      </w:rPr>
+    </w:lvl>
+    <w:lvl w:ilvl="1" w:tplc="040E0003" w:tentative="1">
+      <w:start w:val="1"/>
+      <w:numFmt w:val="bullet"/>
+      <w:lvlText w:val="o"/>
+      <w:lvlJc w:val="left"/>
+      <w:pPr>
+        <w:ind w:left="1440" w:hanging="360"/>
+      </w:pPr>
+      <w:rPr>
+        <w:rFonts w:ascii="Courier New" w:hAnsi="Courier New" w:cs="Courier New" w:hint="default"/>
+      </w:rPr>
+    </w:lvl>
+    <w:lvl w:ilvl="2" w:tplc="040E0005" w:tentative="1">
+      <w:start w:val="1"/>
+      <w:numFmt w:val="bullet"/>
+      <w:lvlText w:val=""/>
+      <w:lvlJc w:val="left"/>
+      <w:pPr>
+        <w:ind w:left="2160" w:hanging="360"/>
+      </w:pPr>
+      <w:rPr>
+        <w:rFonts w:ascii="Wingdings" w:hAnsi="Wingdings" w:hint="default"/>
+      </w:rPr>
+    </w:lvl>
+    <w:lvl w:ilvl="3" w:tplc="040E0001" w:tentative="1">
+      <w:start w:val="1"/>
+      <w:numFmt w:val="bullet"/>
+      <w:lvlText w:val=""/>
+      <w:lvlJc w:val="left"/>
+      <w:pPr>
+        <w:ind w:left="2880" w:hanging="360"/>
+      </w:pPr>
+      <w:rPr>
+        <w:rFonts w:ascii="Symbol" w:hAnsi="Symbol" w:hint="default"/>
+      </w:rPr>
+    </w:lvl>
+    <w:lvl w:ilvl="4" w:tplc="040E0003" w:tentative="1">
+      <w:start w:val="1"/>
+      <w:numFmt w:val="bullet"/>
+      <w:lvlText w:val="o"/>
+      <w:lvlJc w:val="left"/>
+      <w:pPr>
+        <w:ind w:left="3600" w:hanging="360"/>
+      </w:pPr>
+      <w:rPr>
+        <w:rFonts w:ascii="Courier New" w:hAnsi="Courier New" w:cs="Courier New" w:hint="default"/>
+      </w:rPr>
+    </w:lvl>
+    <w:lvl w:ilvl="5" w:tplc="040E0005" w:tentative="1">
+      <w:start w:val="1"/>
+      <w:numFmt w:val="bullet"/>
+      <w:lvlText w:val=""/>
+      <w:lvlJc w:val="left"/>
+      <w:pPr>
+        <w:ind w:left="4320" w:hanging="360"/>
+      </w:pPr>
+      <w:rPr>
+        <w:rFonts w:ascii="Wingdings" w:hAnsi="Wingdings" w:hint="default"/>
+      </w:rPr>
+    </w:lvl>
+    <w:lvl w:ilvl="6" w:tplc="040E0001" w:tentative="1">
+      <w:start w:val="1"/>
+      <w:numFmt w:val="bullet"/>
+      <w:lvlText w:val=""/>
+      <w:lvlJc w:val="left"/>
+      <w:pPr>
+        <w:ind w:left="5040" w:hanging="360"/>
+      </w:pPr>
+      <w:rPr>
+        <w:rFonts w:ascii="Symbol" w:hAnsi="Symbol" w:hint="default"/>
+      </w:rPr>
+    </w:lvl>
+    <w:lvl w:ilvl="7" w:tplc="040E0003" w:tentative="1">
+      <w:start w:val="1"/>
+      <w:numFmt w:val="bullet"/>
+      <w:lvlText w:val="o"/>
+      <w:lvlJc w:val="left"/>
+      <w:pPr>
+        <w:ind w:left="5760" w:hanging="360"/>
+      </w:pPr>
+      <w:rPr>
+        <w:rFonts w:ascii="Courier New" w:hAnsi="Courier New" w:cs="Courier New" w:hint="default"/>
+      </w:rPr>
+    </w:lvl>
+    <w:lvl w:ilvl="8" w:tplc="040E0005" w:tentative="1">
+      <w:start w:val="1"/>
+      <w:numFmt w:val="bullet"/>
+      <w:lvlText w:val=""/>
+      <w:lvlJc w:val="left"/>
+      <w:pPr>
+        <w:ind w:left="6480" w:hanging="360"/>
+      </w:pPr>
+      <w:rPr>
+        <w:rFonts w:ascii="Wingdings" w:hAnsi="Wingdings" w:hint="default"/>
+      </w:rPr>
+    </w:lvl>
+  </w:abstractNum>
+  <w:abstractNum w:abstractNumId="6" w15:restartNumberingAfterBreak="0">
+    <w:nsid w:val="48052D3F"/>
+    <w:multiLevelType w:val="hybridMultilevel"/>
+    <w:tmpl w:val="EA5C5DDA"/>
+    <w:lvl w:ilvl="0" w:tplc="E034D084">
+      <w:start w:val="1"/>
+      <w:numFmt w:val="decimal"/>
+      <w:lvlText w:val="%1"/>
+      <w:lvlJc w:val="left"/>
+      <w:pPr>
+        <w:ind w:left="1065" w:hanging="705"/>
+      </w:pPr>
+      <w:rPr>
+        <w:rFonts w:hint="default"/>
+      </w:rPr>
+    </w:lvl>
+    <w:lvl w:ilvl="1" w:tplc="040E0019" w:tentative="1">
+      <w:start w:val="1"/>
+      <w:numFmt w:val="lowerLetter"/>
+      <w:lvlText w:val="%2."/>
+      <w:lvlJc w:val="left"/>
+      <w:pPr>
+        <w:ind w:left="1440" w:hanging="360"/>
+      </w:pPr>
+    </w:lvl>
+    <w:lvl w:ilvl="2" w:tplc="040E001B" w:tentative="1">
+      <w:start w:val="1"/>
+      <w:numFmt w:val="lowerRoman"/>
+      <w:lvlText w:val="%3."/>
+      <w:lvlJc w:val="right"/>
+      <w:pPr>
+        <w:ind w:left="2160" w:hanging="180"/>
+      </w:pPr>
+    </w:lvl>
+    <w:lvl w:ilvl="3" w:tplc="040E000F" w:tentative="1">
+      <w:start w:val="1"/>
+      <w:numFmt w:val="decimal"/>
+      <w:lvlText w:val="%4."/>
+      <w:lvlJc w:val="left"/>
+      <w:pPr>
+        <w:ind w:left="2880" w:hanging="360"/>
+      </w:pPr>
+    </w:lvl>
+    <w:lvl w:ilvl="4" w:tplc="040E0019" w:tentative="1">
+      <w:start w:val="1"/>
+      <w:numFmt w:val="lowerLetter"/>
+      <w:lvlText w:val="%5."/>
+      <w:lvlJc w:val="left"/>
+      <w:pPr>
+        <w:ind w:left="3600" w:hanging="360"/>
+      </w:pPr>
+    </w:lvl>
+    <w:lvl w:ilvl="5" w:tplc="040E001B" w:tentative="1">
+      <w:start w:val="1"/>
+      <w:numFmt w:val="lowerRoman"/>
+      <w:lvlText w:val="%6."/>
+      <w:lvlJc w:val="right"/>
+      <w:pPr>
+        <w:ind w:left="4320" w:hanging="180"/>
+      </w:pPr>
+    </w:lvl>
+    <w:lvl w:ilvl="6" w:tplc="040E000F" w:tentative="1">
+      <w:start w:val="1"/>
+      <w:numFmt w:val="decimal"/>
+      <w:lvlText w:val="%7."/>
+      <w:lvlJc w:val="left"/>
+      <w:pPr>
+        <w:ind w:left="5040" w:hanging="360"/>
+      </w:pPr>
+    </w:lvl>
+    <w:lvl w:ilvl="7" w:tplc="040E0019" w:tentative="1">
+      <w:start w:val="1"/>
+      <w:numFmt w:val="lowerLetter"/>
+      <w:lvlText w:val="%8."/>
+      <w:lvlJc w:val="left"/>
+      <w:pPr>
+        <w:ind w:left="5760" w:hanging="360"/>
+      </w:pPr>
+    </w:lvl>
+    <w:lvl w:ilvl="8" w:tplc="040E001B" w:tentative="1">
+      <w:start w:val="1"/>
+      <w:numFmt w:val="lowerRoman"/>
+      <w:lvlText w:val="%9."/>
+      <w:lvlJc w:val="right"/>
+      <w:pPr>
+        <w:ind w:left="6480" w:hanging="180"/>
+      </w:pPr>
+    </w:lvl>
+  </w:abstractNum>
+  <w:abstractNum w:abstractNumId="7" w15:restartNumberingAfterBreak="0">
+    <w:nsid w:val="49150073"/>
+    <w:multiLevelType w:val="hybridMultilevel"/>
+    <w:tmpl w:val="231EAF72"/>
+    <w:lvl w:ilvl="0" w:tplc="040E000F">
+      <w:start w:val="1"/>
+      <w:numFmt w:val="decimal"/>
+      <w:lvlText w:val="%1."/>
+      <w:lvlJc w:val="left"/>
+      <w:pPr>
+        <w:ind w:left="720" w:hanging="360"/>
+      </w:pPr>
+      <w:rPr>
+        <w:rFonts w:hint="default"/>
+      </w:rPr>
+    </w:lvl>
+    <w:lvl w:ilvl="1" w:tplc="040E0019" w:tentative="1">
+      <w:start w:val="1"/>
+      <w:numFmt w:val="lowerLetter"/>
+      <w:lvlText w:val="%2."/>
+      <w:lvlJc w:val="left"/>
+      <w:pPr>
+        <w:ind w:left="1440" w:hanging="360"/>
+      </w:pPr>
+    </w:lvl>
+    <w:lvl w:ilvl="2" w:tplc="040E001B" w:tentative="1">
+      <w:start w:val="1"/>
+      <w:numFmt w:val="lowerRoman"/>
+      <w:lvlText w:val="%3."/>
+      <w:lvlJc w:val="right"/>
+      <w:pPr>
+        <w:ind w:left="2160" w:hanging="180"/>
+      </w:pPr>
+    </w:lvl>
+    <w:lvl w:ilvl="3" w:tplc="040E000F" w:tentative="1">
+      <w:start w:val="1"/>
+      <w:numFmt w:val="decimal"/>
+      <w:lvlText w:val="%4."/>
+      <w:lvlJc w:val="left"/>
+      <w:pPr>
+        <w:ind w:left="2880" w:hanging="360"/>
+      </w:pPr>
+    </w:lvl>
+    <w:lvl w:ilvl="4" w:tplc="040E0019" w:tentative="1">
+      <w:start w:val="1"/>
+      <w:numFmt w:val="lowerLetter"/>
+      <w:lvlText w:val="%5."/>
+      <w:lvlJc w:val="left"/>
+      <w:pPr>
+        <w:ind w:left="3600" w:hanging="360"/>
+      </w:pPr>
+    </w:lvl>
+    <w:lvl w:ilvl="5" w:tplc="040E001B" w:tentative="1">
+      <w:start w:val="1"/>
+      <w:numFmt w:val="lowerRoman"/>
+      <w:lvlText w:val="%6."/>
+      <w:lvlJc w:val="right"/>
+      <w:pPr>
+        <w:ind w:left="4320" w:hanging="180"/>
+      </w:pPr>
+    </w:lvl>
+    <w:lvl w:ilvl="6" w:tplc="040E000F" w:tentative="1">
+      <w:start w:val="1"/>
+      <w:numFmt w:val="decimal"/>
+      <w:lvlText w:val="%7."/>
+      <w:lvlJc w:val="left"/>
+      <w:pPr>
+        <w:ind w:left="5040" w:hanging="360"/>
+      </w:pPr>
+    </w:lvl>
+    <w:lvl w:ilvl="7" w:tplc="040E0019" w:tentative="1">
+      <w:start w:val="1"/>
+      <w:numFmt w:val="lowerLetter"/>
+      <w:lvlText w:val="%8."/>
+      <w:lvlJc w:val="left"/>
+      <w:pPr>
+        <w:ind w:left="5760" w:hanging="360"/>
+      </w:pPr>
+    </w:lvl>
+    <w:lvl w:ilvl="8" w:tplc="040E001B" w:tentative="1">
+      <w:start w:val="1"/>
+      <w:numFmt w:val="lowerRoman"/>
+      <w:lvlText w:val="%9."/>
+      <w:lvlJc w:val="right"/>
+      <w:pPr>
+        <w:ind w:left="6480" w:hanging="180"/>
+      </w:pPr>
+    </w:lvl>
+  </w:abstractNum>
+  <w:abstractNum w:abstractNumId="8" w15:restartNumberingAfterBreak="0">
+    <w:nsid w:val="4DCE0CD8"/>
+    <w:multiLevelType w:val="hybridMultilevel"/>
+    <w:tmpl w:val="E36C6AAE"/>
+    <w:lvl w:ilvl="0" w:tplc="4DDC3FBC">
+      <w:numFmt w:val="bullet"/>
+      <w:lvlText w:val="-"/>
+      <w:lvlJc w:val="left"/>
+      <w:pPr>
+        <w:ind w:left="720" w:hanging="360"/>
+      </w:pPr>
+      <w:rPr>
+        <w:rFonts w:ascii="Calibri" w:eastAsiaTheme="minorHAnsi" w:hAnsi="Calibri" w:cs="Calibri" w:hint="default"/>
+      </w:rPr>
+    </w:lvl>
+    <w:lvl w:ilvl="1" w:tplc="040E0003" w:tentative="1">
+      <w:start w:val="1"/>
+      <w:numFmt w:val="bullet"/>
+      <w:lvlText w:val="o"/>
+      <w:lvlJc w:val="left"/>
+      <w:pPr>
+        <w:ind w:left="1440" w:hanging="360"/>
+      </w:pPr>
+      <w:rPr>
+        <w:rFonts w:ascii="Courier New" w:hAnsi="Courier New" w:cs="Courier New" w:hint="default"/>
+      </w:rPr>
+    </w:lvl>
+    <w:lvl w:ilvl="2" w:tplc="040E0005" w:tentative="1">
+      <w:start w:val="1"/>
+      <w:numFmt w:val="bullet"/>
+      <w:lvlText w:val=""/>
+      <w:lvlJc w:val="left"/>
+      <w:pPr>
+        <w:ind w:left="2160" w:hanging="360"/>
+      </w:pPr>
+      <w:rPr>
+        <w:rFonts w:ascii="Wingdings" w:hAnsi="Wingdings" w:hint="default"/>
+      </w:rPr>
+    </w:lvl>
+    <w:lvl w:ilvl="3" w:tplc="040E0001" w:tentative="1">
+      <w:start w:val="1"/>
+      <w:numFmt w:val="bullet"/>
+      <w:lvlText w:val=""/>
+      <w:lvlJc w:val="left"/>
+      <w:pPr>
+        <w:ind w:left="2880" w:hanging="360"/>
+      </w:pPr>
+      <w:rPr>
+        <w:rFonts w:ascii="Symbol" w:hAnsi="Symbol" w:hint="default"/>
+      </w:rPr>
+    </w:lvl>
+    <w:lvl w:ilvl="4" w:tplc="040E0003" w:tentative="1">
+      <w:start w:val="1"/>
+      <w:numFmt w:val="bullet"/>
+      <w:lvlText w:val="o"/>
+      <w:lvlJc w:val="left"/>
+      <w:pPr>
+        <w:ind w:left="3600" w:hanging="360"/>
+      </w:pPr>
+      <w:rPr>
+        <w:rFonts w:ascii="Courier New" w:hAnsi="Courier New" w:cs="Courier New" w:hint="default"/>
+      </w:rPr>
+    </w:lvl>
+    <w:lvl w:ilvl="5" w:tplc="040E0005" w:tentative="1">
+      <w:start w:val="1"/>
+      <w:numFmt w:val="bullet"/>
+      <w:lvlText w:val=""/>
+      <w:lvlJc w:val="left"/>
+      <w:pPr>
+        <w:ind w:left="4320" w:hanging="360"/>
+      </w:pPr>
+      <w:rPr>
+        <w:rFonts w:ascii="Wingdings" w:hAnsi="Wingdings" w:hint="default"/>
+      </w:rPr>
+    </w:lvl>
+    <w:lvl w:ilvl="6" w:tplc="040E0001" w:tentative="1">
+      <w:start w:val="1"/>
+      <w:numFmt w:val="bullet"/>
+      <w:lvlText w:val=""/>
+      <w:lvlJc w:val="left"/>
+      <w:pPr>
+        <w:ind w:left="5040" w:hanging="360"/>
+      </w:pPr>
+      <w:rPr>
+        <w:rFonts w:ascii="Symbol" w:hAnsi="Symbol" w:hint="default"/>
+      </w:rPr>
+    </w:lvl>
+    <w:lvl w:ilvl="7" w:tplc="040E0003" w:tentative="1">
+      <w:start w:val="1"/>
+      <w:numFmt w:val="bullet"/>
+      <w:lvlText w:val="o"/>
+      <w:lvlJc w:val="left"/>
+      <w:pPr>
+        <w:ind w:left="5760" w:hanging="360"/>
+      </w:pPr>
+      <w:rPr>
+        <w:rFonts w:ascii="Courier New" w:hAnsi="Courier New" w:cs="Courier New" w:hint="default"/>
+      </w:rPr>
+    </w:lvl>
+    <w:lvl w:ilvl="8" w:tplc="040E0005" w:tentative="1">
+      <w:start w:val="1"/>
+      <w:numFmt w:val="bullet"/>
+      <w:lvlText w:val=""/>
+      <w:lvlJc w:val="left"/>
+      <w:pPr>
+        <w:ind w:left="6480" w:hanging="360"/>
+      </w:pPr>
+      <w:rPr>
+        <w:rFonts w:ascii="Wingdings" w:hAnsi="Wingdings" w:hint="default"/>
+      </w:rPr>
+    </w:lvl>
+  </w:abstractNum>
+  <w:abstractNum w:abstractNumId="9" w15:restartNumberingAfterBreak="0">
+    <w:nsid w:val="52850205"/>
+    <w:multiLevelType w:val="hybridMultilevel"/>
+    <w:tmpl w:val="83248A74"/>
+    <w:lvl w:ilvl="0" w:tplc="4DDC3FBC">
+      <w:numFmt w:val="bullet"/>
+      <w:lvlText w:val="-"/>
+      <w:lvlJc w:val="left"/>
+      <w:pPr>
+        <w:ind w:left="720" w:hanging="360"/>
+      </w:pPr>
+      <w:rPr>
+        <w:rFonts w:ascii="Calibri" w:eastAsiaTheme="minorHAnsi" w:hAnsi="Calibri" w:cs="Calibri" w:hint="default"/>
+      </w:rPr>
+    </w:lvl>
+    <w:lvl w:ilvl="1" w:tplc="040E0003" w:tentative="1">
+      <w:start w:val="1"/>
+      <w:numFmt w:val="bullet"/>
+      <w:lvlText w:val="o"/>
+      <w:lvlJc w:val="left"/>
+      <w:pPr>
+        <w:ind w:left="1440" w:hanging="360"/>
+      </w:pPr>
+      <w:rPr>
+        <w:rFonts w:ascii="Courier New" w:hAnsi="Courier New" w:cs="Courier New" w:hint="default"/>
+      </w:rPr>
+    </w:lvl>
+    <w:lvl w:ilvl="2" w:tplc="040E0005" w:tentative="1">
+      <w:start w:val="1"/>
+      <w:numFmt w:val="bullet"/>
+      <w:lvlText w:val=""/>
+      <w:lvlJc w:val="left"/>
+      <w:pPr>
+        <w:ind w:left="2160" w:hanging="360"/>
+      </w:pPr>
+      <w:rPr>
+        <w:rFonts w:ascii="Wingdings" w:hAnsi="Wingdings" w:hint="default"/>
+      </w:rPr>
+    </w:lvl>
+    <w:lvl w:ilvl="3" w:tplc="040E0001" w:tentative="1">
+      <w:start w:val="1"/>
+      <w:numFmt w:val="bullet"/>
+      <w:lvlText w:val=""/>
+      <w:lvlJc w:val="left"/>
+      <w:pPr>
+        <w:ind w:left="2880" w:hanging="360"/>
+      </w:pPr>
+      <w:rPr>
+        <w:rFonts w:ascii="Symbol" w:hAnsi="Symbol" w:hint="default"/>
+      </w:rPr>
+    </w:lvl>
+    <w:lvl w:ilvl="4" w:tplc="040E0003" w:tentative="1">
+      <w:start w:val="1"/>
+      <w:numFmt w:val="bullet"/>
+      <w:lvlText w:val="o"/>
+      <w:lvlJc w:val="left"/>
+      <w:pPr>
+        <w:ind w:left="3600" w:hanging="360"/>
+      </w:pPr>
+      <w:rPr>
+        <w:rFonts w:ascii="Courier New" w:hAnsi="Courier New" w:cs="Courier New" w:hint="default"/>
+      </w:rPr>
+    </w:lvl>
+    <w:lvl w:ilvl="5" w:tplc="040E0005" w:tentative="1">
+      <w:start w:val="1"/>
+      <w:numFmt w:val="bullet"/>
+      <w:lvlText w:val=""/>
+      <w:lvlJc w:val="left"/>
+      <w:pPr>
+        <w:ind w:left="4320" w:hanging="360"/>
+      </w:pPr>
+      <w:rPr>
+        <w:rFonts w:ascii="Wingdings" w:hAnsi="Wingdings" w:hint="default"/>
+      </w:rPr>
+    </w:lvl>
+    <w:lvl w:ilvl="6" w:tplc="040E0001" w:tentative="1">
+      <w:start w:val="1"/>
+      <w:numFmt w:val="bullet"/>
+      <w:lvlText w:val=""/>
+      <w:lvlJc w:val="left"/>
+      <w:pPr>
+        <w:ind w:left="5040" w:hanging="360"/>
+      </w:pPr>
+      <w:rPr>
+        <w:rFonts w:ascii="Symbol" w:hAnsi="Symbol" w:hint="default"/>
+      </w:rPr>
+    </w:lvl>
+    <w:lvl w:ilvl="7" w:tplc="040E0003" w:tentative="1">
+      <w:start w:val="1"/>
+      <w:numFmt w:val="bullet"/>
+      <w:lvlText w:val="o"/>
+      <w:lvlJc w:val="left"/>
+      <w:pPr>
+        <w:ind w:left="5760" w:hanging="360"/>
+      </w:pPr>
+      <w:rPr>
+        <w:rFonts w:ascii="Courier New" w:hAnsi="Courier New" w:cs="Courier New" w:hint="default"/>
+      </w:rPr>
+    </w:lvl>
+    <w:lvl w:ilvl="8" w:tplc="040E0005" w:tentative="1">
+      <w:start w:val="1"/>
+      <w:numFmt w:val="bullet"/>
+      <w:lvlText w:val=""/>
+      <w:lvlJc w:val="left"/>
+      <w:pPr>
+        <w:ind w:left="6480" w:hanging="360"/>
+      </w:pPr>
+      <w:rPr>
+        <w:rFonts w:ascii="Wingdings" w:hAnsi="Wingdings" w:hint="default"/>
+      </w:rPr>
+    </w:lvl>
+  </w:abstractNum>
+  <w:abstractNum w:abstractNumId="10" w15:restartNumberingAfterBreak="0">
+    <w:nsid w:val="7DFB6515"/>
+    <w:multiLevelType w:val="hybridMultilevel"/>
+    <w:tmpl w:val="38849052"/>
+    <w:lvl w:ilvl="0" w:tplc="4DDC3FBC">
+      <w:numFmt w:val="bullet"/>
+      <w:lvlText w:val="-"/>
+      <w:lvlJc w:val="left"/>
+      <w:pPr>
+        <w:ind w:left="720" w:hanging="360"/>
+      </w:pPr>
+      <w:rPr>
+        <w:rFonts w:ascii="Calibri" w:eastAsiaTheme="minorHAnsi" w:hAnsi="Calibri" w:cs="Calibri" w:hint="default"/>
+      </w:rPr>
+    </w:lvl>
+    <w:lvl w:ilvl="1" w:tplc="040E0003" w:tentative="1">
+      <w:start w:val="1"/>
+      <w:numFmt w:val="bullet"/>
+      <w:lvlText w:val="o"/>
+      <w:lvlJc w:val="left"/>
+      <w:pPr>
+        <w:ind w:left="1440" w:hanging="360"/>
+      </w:pPr>
+      <w:rPr>
+        <w:rFonts w:ascii="Courier New" w:hAnsi="Courier New" w:cs="Courier New" w:hint="default"/>
+      </w:rPr>
+    </w:lvl>
+    <w:lvl w:ilvl="2" w:tplc="040E0005" w:tentative="1">
+      <w:start w:val="1"/>
+      <w:numFmt w:val="bullet"/>
+      <w:lvlText w:val=""/>
+      <w:lvlJc w:val="left"/>
+      <w:pPr>
+        <w:ind w:left="2160" w:hanging="360"/>
+      </w:pPr>
+      <w:rPr>
+        <w:rFonts w:ascii="Wingdings" w:hAnsi="Wingdings" w:hint="default"/>
+      </w:rPr>
+    </w:lvl>
+    <w:lvl w:ilvl="3" w:tplc="040E0001" w:tentative="1">
+      <w:start w:val="1"/>
+      <w:numFmt w:val="bullet"/>
+      <w:lvlText w:val=""/>
+      <w:lvlJc w:val="left"/>
+      <w:pPr>
+        <w:ind w:left="2880" w:hanging="360"/>
+      </w:pPr>
+      <w:rPr>
+        <w:rFonts w:ascii="Symbol" w:hAnsi="Symbol" w:hint="default"/>
+      </w:rPr>
+    </w:lvl>
+    <w:lvl w:ilvl="4" w:tplc="040E0003" w:tentative="1">
+      <w:start w:val="1"/>
+      <w:numFmt w:val="bullet"/>
+      <w:lvlText w:val="o"/>
+      <w:lvlJc w:val="left"/>
+      <w:pPr>
+        <w:ind w:left="3600" w:hanging="360"/>
+      </w:pPr>
+      <w:rPr>
+        <w:rFonts w:ascii="Courier New" w:hAnsi="Courier New" w:cs="Courier New" w:hint="default"/>
+      </w:rPr>
+    </w:lvl>
+    <w:lvl w:ilvl="5" w:tplc="040E0005" w:tentative="1">
+      <w:start w:val="1"/>
+      <w:numFmt w:val="bullet"/>
+      <w:lvlText w:val=""/>
+      <w:lvlJc w:val="left"/>
+      <w:pPr>
+        <w:ind w:left="4320" w:hanging="360"/>
+      </w:pPr>
+      <w:rPr>
+        <w:rFonts w:ascii="Wingdings" w:hAnsi="Wingdings" w:hint="default"/>
+      </w:rPr>
+    </w:lvl>
+    <w:lvl w:ilvl="6" w:tplc="040E0001" w:tentative="1">
+      <w:start w:val="1"/>
+      <w:numFmt w:val="bullet"/>
+      <w:lvlText w:val=""/>
+      <w:lvlJc w:val="left"/>
+      <w:pPr>
+        <w:ind w:left="5040" w:hanging="360"/>
+      </w:pPr>
+      <w:rPr>
+        <w:rFonts w:ascii="Symbol" w:hAnsi="Symbol" w:hint="default"/>
+      </w:rPr>
+    </w:lvl>
+    <w:lvl w:ilvl="7" w:tplc="040E0003" w:tentative="1">
+      <w:start w:val="1"/>
+      <w:numFmt w:val="bullet"/>
+      <w:lvlText w:val="o"/>
+      <w:lvlJc w:val="left"/>
+      <w:pPr>
+        <w:ind w:left="5760" w:hanging="360"/>
+      </w:pPr>
+      <w:rPr>
+        <w:rFonts w:ascii="Courier New" w:hAnsi="Courier New" w:cs="Courier New" w:hint="default"/>
+      </w:rPr>
+    </w:lvl>
+    <w:lvl w:ilvl="8" w:tplc="040E0005" w:tentative="1">
+      <w:start w:val="1"/>
+      <w:numFmt w:val="bullet"/>
+      <w:lvlText w:val=""/>
+      <w:lvlJc w:val="left"/>
+      <w:pPr>
+        <w:ind w:left="6480" w:hanging="360"/>
+      </w:pPr>
+      <w:rPr>
+        <w:rFonts w:ascii="Wingdings" w:hAnsi="Wingdings" w:hint="default"/>
+      </w:rPr>
+    </w:lvl>
+  </w:abstractNum>
+  <w:num w:numId="1" w16cid:durableId="1458447663">
+    <w:abstractNumId w:val="9"/>
+  </w:num>
+  <w:num w:numId="2" w16cid:durableId="149491499">
+    <w:abstractNumId w:val="7"/>
+  </w:num>
+  <w:num w:numId="3" w16cid:durableId="1015569494">
+    <w:abstractNumId w:val="1"/>
+  </w:num>
+  <w:num w:numId="4" w16cid:durableId="612249639">
+    <w:abstractNumId w:val="0"/>
+  </w:num>
+  <w:num w:numId="5" w16cid:durableId="1623464307">
+    <w:abstractNumId w:val="10"/>
+  </w:num>
+  <w:num w:numId="6" w16cid:durableId="351611773">
+    <w:abstractNumId w:val="3"/>
+  </w:num>
+  <w:num w:numId="7" w16cid:durableId="51537882">
+    <w:abstractNumId w:val="6"/>
+  </w:num>
+  <w:num w:numId="8" w16cid:durableId="1430006417">
+    <w:abstractNumId w:val="4"/>
+  </w:num>
+  <w:num w:numId="9" w16cid:durableId="24645574">
+    <w:abstractNumId w:val="5"/>
+  </w:num>
+  <w:num w:numId="10" w16cid:durableId="191844207">
+    <w:abstractNumId w:val="2"/>
+  </w:num>
+  <w:num w:numId="11" w16cid:durableId="143593944">
+    <w:abstractNumId w:val="8"/>
+  </w:num>
+</w:numbering>
 </file>
 
 <file path=word/styles.xml><?xml version="1.0" encoding="utf-8"?>
@@ -467,7 +3049,6 @@
     <w:next w:val="Normal"/>
     <w:link w:val="Heading2Char"/>
     <w:uiPriority w:val="9"/>
-    <w:semiHidden/>
     <w:unhideWhenUsed/>
     <w:qFormat/>
     <w:rsid w:val="00727DCA"/>
@@ -490,7 +3071,6 @@
     <w:next w:val="Normal"/>
     <w:link w:val="Heading3Char"/>
     <w:uiPriority w:val="9"/>
-    <w:semiHidden/>
     <w:unhideWhenUsed/>
     <w:qFormat/>
     <w:rsid w:val="00727DCA"/>
@@ -642,7 +3222,6 @@
   <w:style w:type="character" w:default="1" w:styleId="DefaultParagraphFont">
     <w:name w:val="Default Paragraph Font"/>
     <w:uiPriority w:val="1"/>
-    <w:semiHidden/>
     <w:unhideWhenUsed/>
   </w:style>
   <w:style w:type="table" w:default="1" w:styleId="TableNormal">
@@ -684,7 +3263,6 @@
     <w:basedOn w:val="DefaultParagraphFont"/>
     <w:link w:val="Heading2"/>
     <w:uiPriority w:val="9"/>
-    <w:semiHidden/>
     <w:rsid w:val="00727DCA"/>
     <w:rPr>
       <w:rFonts w:asciiTheme="majorHAnsi" w:eastAsiaTheme="majorEastAsia" w:hAnsiTheme="majorHAnsi" w:cstheme="majorBidi"/>
@@ -698,7 +3276,6 @@
     <w:basedOn w:val="DefaultParagraphFont"/>
     <w:link w:val="Heading3"/>
     <w:uiPriority w:val="9"/>
-    <w:semiHidden/>
     <w:rsid w:val="00727DCA"/>
     <w:rPr>
       <w:rFonts w:eastAsiaTheme="majorEastAsia" w:cstheme="majorBidi"/>

</xml_diff>

<commit_message>
readme updated, project scope refined, new approach to protocol emerged and discussed.
</commit_message>
<xml_diff>
--- a/Mini Network Simulator with Java.docx
+++ b/Mini Network Simulator with Java.docx
@@ -88,6 +88,9 @@
     </w:p>
     <w:p>
       <w:r>
+        <w:rPr>
+          <w:noProof/>
+        </w:rPr>
         <w:drawing>
           <wp:inline distT="0" distB="0" distL="0" distR="0" wp14:anchorId="433195F5" wp14:editId="3D53E8A3">
             <wp:extent cx="5760720" cy="3574415"/>
@@ -343,7 +346,6 @@
         <w:t xml:space="preserve"> </w:t>
       </w:r>
       <w:proofErr w:type="spellStart"/>
-      <w:proofErr w:type="gramStart"/>
       <w:r>
         <w:t>Portnumber</w:t>
       </w:r>
@@ -356,7 +358,6 @@
         <w:t>Values</w:t>
       </w:r>
       <w:proofErr w:type="spellEnd"/>
-      <w:proofErr w:type="gramEnd"/>
     </w:p>
     <w:p>
       <w:pPr>
@@ -527,10 +528,7 @@
       </w:r>
       <w:proofErr w:type="spellEnd"/>
       <w:r>
-        <w:t xml:space="preserve"> </w:t>
-      </w:r>
-      <w:r>
-        <w:t>o</w:t>
+        <w:t xml:space="preserve"> o</w:t>
       </w:r>
       <w:r>
         <w:t xml:space="preserve">ver </w:t>
@@ -552,7 +550,6 @@
         <w:t xml:space="preserve"> </w:t>
       </w:r>
       <w:proofErr w:type="spellStart"/>
-      <w:proofErr w:type="gramStart"/>
       <w:r>
         <w:t>Portnumber</w:t>
       </w:r>
@@ -565,7 +562,6 @@
         <w:t>Values</w:t>
       </w:r>
       <w:proofErr w:type="spellEnd"/>
-      <w:proofErr w:type="gramEnd"/>
     </w:p>
     <w:p>
       <w:pPr>
@@ -999,11 +995,11 @@
         </w:numPr>
       </w:pPr>
       <w:r>
-        <w:t>MAC addres</w:t>
-      </w:r>
-      <w:proofErr w:type="spellStart"/>
-      <w:r>
-        <w:t>s</w:t>
+        <w:t xml:space="preserve">MAC </w:t>
+      </w:r>
+      <w:proofErr w:type="spellStart"/>
+      <w:r>
+        <w:t>address</w:t>
       </w:r>
       <w:proofErr w:type="spellEnd"/>
       <w:r>
@@ -1409,7 +1405,604 @@
       </w:r>
       <w:proofErr w:type="spellEnd"/>
     </w:p>
-    <w:p/>
+    <w:p>
+      <w:r>
+        <w:br w:type="page"/>
+      </w:r>
+    </w:p>
+    <w:p>
+      <w:proofErr w:type="spellStart"/>
+      <w:r>
+        <w:lastRenderedPageBreak/>
+        <w:t>Packets</w:t>
+      </w:r>
+      <w:proofErr w:type="spellEnd"/>
+      <w:r>
+        <w:t xml:space="preserve">, </w:t>
+      </w:r>
+      <w:proofErr w:type="spellStart"/>
+      <w:r>
+        <w:t>Protocols</w:t>
+      </w:r>
+      <w:proofErr w:type="spellEnd"/>
+      <w:r>
+        <w:t xml:space="preserve"> and </w:t>
+      </w:r>
+      <w:proofErr w:type="spellStart"/>
+      <w:r>
+        <w:t>their</w:t>
+      </w:r>
+      <w:proofErr w:type="spellEnd"/>
+      <w:r>
+        <w:t xml:space="preserve"> </w:t>
+      </w:r>
+      <w:proofErr w:type="spellStart"/>
+      <w:r>
+        <w:t>headers</w:t>
+      </w:r>
+      <w:proofErr w:type="spellEnd"/>
+      <w:r>
+        <w:t xml:space="preserve"> in </w:t>
+      </w:r>
+      <w:proofErr w:type="spellStart"/>
+      <w:r>
+        <w:t>protocols</w:t>
+      </w:r>
+      <w:proofErr w:type="spellEnd"/>
+    </w:p>
+    <w:p>
+      <w:proofErr w:type="spellStart"/>
+      <w:r>
+        <w:t>Refer</w:t>
+      </w:r>
+      <w:proofErr w:type="spellEnd"/>
+      <w:r>
+        <w:t xml:space="preserve"> </w:t>
+      </w:r>
+      <w:proofErr w:type="spellStart"/>
+      <w:r>
+        <w:t>to</w:t>
+      </w:r>
+      <w:proofErr w:type="spellEnd"/>
+      <w:r>
+        <w:t xml:space="preserve"> </w:t>
+      </w:r>
+      <w:proofErr w:type="spellStart"/>
+      <w:r>
+        <w:t>each</w:t>
+      </w:r>
+      <w:proofErr w:type="spellEnd"/>
+      <w:r>
+        <w:t xml:space="preserve"> (</w:t>
+      </w:r>
+      <w:proofErr w:type="spellStart"/>
+      <w:r>
+        <w:t>useful</w:t>
+      </w:r>
+      <w:proofErr w:type="spellEnd"/>
+      <w:r>
+        <w:t xml:space="preserve"> </w:t>
+      </w:r>
+      <w:proofErr w:type="spellStart"/>
+      <w:r>
+        <w:t>for</w:t>
+      </w:r>
+      <w:proofErr w:type="spellEnd"/>
+      <w:r>
+        <w:t xml:space="preserve"> </w:t>
+      </w:r>
+      <w:proofErr w:type="spellStart"/>
+      <w:r>
+        <w:t>our</w:t>
+      </w:r>
+      <w:proofErr w:type="spellEnd"/>
+      <w:r>
+        <w:t xml:space="preserve"> </w:t>
+      </w:r>
+      <w:proofErr w:type="spellStart"/>
+      <w:r>
+        <w:t>implementation</w:t>
+      </w:r>
+      <w:proofErr w:type="spellEnd"/>
+      <w:r>
+        <w:t xml:space="preserve">) </w:t>
+      </w:r>
+      <w:proofErr w:type="spellStart"/>
+      <w:r>
+        <w:t>field</w:t>
+      </w:r>
+      <w:proofErr w:type="spellEnd"/>
+      <w:r>
+        <w:t xml:space="preserve"> in </w:t>
+      </w:r>
+      <w:proofErr w:type="spellStart"/>
+      <w:r>
+        <w:t>each</w:t>
+      </w:r>
+      <w:proofErr w:type="spellEnd"/>
+      <w:r>
+        <w:t xml:space="preserve"> </w:t>
+      </w:r>
+      <w:proofErr w:type="spellStart"/>
+      <w:r>
+        <w:t>protocol</w:t>
+      </w:r>
+      <w:proofErr w:type="spellEnd"/>
+    </w:p>
+    <w:p>
+      <w:proofErr w:type="spellStart"/>
+      <w:r>
+        <w:t>Have</w:t>
+      </w:r>
+      <w:proofErr w:type="spellEnd"/>
+      <w:r>
+        <w:t xml:space="preserve"> a </w:t>
+      </w:r>
+      <w:proofErr w:type="spellStart"/>
+      <w:r>
+        <w:t>common</w:t>
+      </w:r>
+      <w:proofErr w:type="spellEnd"/>
+      <w:r>
+        <w:t xml:space="preserve"> </w:t>
+      </w:r>
+      <w:proofErr w:type="spellStart"/>
+      <w:r>
+        <w:t>protocol</w:t>
+      </w:r>
+      <w:proofErr w:type="spellEnd"/>
+      <w:r>
+        <w:t xml:space="preserve"> </w:t>
+      </w:r>
+      <w:proofErr w:type="spellStart"/>
+      <w:r>
+        <w:t>class</w:t>
+      </w:r>
+      <w:proofErr w:type="spellEnd"/>
+    </w:p>
+    <w:p>
+      <w:pPr>
+        <w:pStyle w:val="ListParagraph"/>
+        <w:numPr>
+          <w:ilvl w:val="0"/>
+          <w:numId w:val="11"/>
+        </w:numPr>
+      </w:pPr>
+      <w:proofErr w:type="spellStart"/>
+      <w:r>
+        <w:t>this</w:t>
+      </w:r>
+      <w:proofErr w:type="spellEnd"/>
+      <w:r>
+        <w:t xml:space="preserve"> </w:t>
+      </w:r>
+      <w:proofErr w:type="spellStart"/>
+      <w:r>
+        <w:t>way</w:t>
+      </w:r>
+      <w:proofErr w:type="spellEnd"/>
+      <w:r>
+        <w:t xml:space="preserve"> </w:t>
+      </w:r>
+      <w:proofErr w:type="spellStart"/>
+      <w:r>
+        <w:t>we</w:t>
+      </w:r>
+      <w:proofErr w:type="spellEnd"/>
+      <w:r>
+        <w:t xml:space="preserve"> </w:t>
+      </w:r>
+      <w:proofErr w:type="spellStart"/>
+      <w:r>
+        <w:t>can</w:t>
+      </w:r>
+      <w:proofErr w:type="spellEnd"/>
+      <w:r>
+        <w:t xml:space="preserve"> </w:t>
+      </w:r>
+      <w:proofErr w:type="spellStart"/>
+      <w:r>
+        <w:t>have</w:t>
+      </w:r>
+      <w:proofErr w:type="spellEnd"/>
+      <w:r>
+        <w:t xml:space="preserve"> </w:t>
+      </w:r>
+      <w:proofErr w:type="spellStart"/>
+      <w:r>
+        <w:t>all</w:t>
+      </w:r>
+      <w:proofErr w:type="spellEnd"/>
+      <w:r>
+        <w:t xml:space="preserve"> </w:t>
+      </w:r>
+      <w:proofErr w:type="spellStart"/>
+      <w:r>
+        <w:t>protocols</w:t>
+      </w:r>
+      <w:proofErr w:type="spellEnd"/>
+      <w:r>
+        <w:t xml:space="preserve"> in a </w:t>
+      </w:r>
+      <w:proofErr w:type="spellStart"/>
+      <w:r>
+        <w:t>universal</w:t>
+      </w:r>
+      <w:proofErr w:type="spellEnd"/>
+      <w:r>
+        <w:t xml:space="preserve"> </w:t>
+      </w:r>
+      <w:proofErr w:type="spellStart"/>
+      <w:r>
+        <w:t>list</w:t>
+      </w:r>
+      <w:proofErr w:type="spellEnd"/>
+    </w:p>
+    <w:p>
+      <w:pPr>
+        <w:pStyle w:val="ListParagraph"/>
+        <w:numPr>
+          <w:ilvl w:val="0"/>
+          <w:numId w:val="11"/>
+        </w:numPr>
+      </w:pPr>
+      <w:proofErr w:type="spellStart"/>
+      <w:r>
+        <w:t>this</w:t>
+      </w:r>
+      <w:proofErr w:type="spellEnd"/>
+      <w:r>
+        <w:t xml:space="preserve"> </w:t>
+      </w:r>
+      <w:proofErr w:type="spellStart"/>
+      <w:r>
+        <w:t>way</w:t>
+      </w:r>
+      <w:proofErr w:type="spellEnd"/>
+      <w:r>
+        <w:t xml:space="preserve"> </w:t>
+      </w:r>
+      <w:proofErr w:type="spellStart"/>
+      <w:r>
+        <w:t>each</w:t>
+      </w:r>
+      <w:proofErr w:type="spellEnd"/>
+      <w:r>
+        <w:t xml:space="preserve"> </w:t>
+      </w:r>
+      <w:proofErr w:type="spellStart"/>
+      <w:r>
+        <w:t>message</w:t>
+      </w:r>
+      <w:proofErr w:type="spellEnd"/>
+      <w:r>
+        <w:t xml:space="preserve"> </w:t>
+      </w:r>
+      <w:proofErr w:type="spellStart"/>
+      <w:r>
+        <w:t>can</w:t>
+      </w:r>
+      <w:proofErr w:type="spellEnd"/>
+      <w:r>
+        <w:t xml:space="preserve"> be </w:t>
+      </w:r>
+      <w:proofErr w:type="spellStart"/>
+      <w:r>
+        <w:t>universal</w:t>
+      </w:r>
+      <w:proofErr w:type="spellEnd"/>
+      <w:r>
+        <w:t xml:space="preserve">, and </w:t>
+      </w:r>
+      <w:proofErr w:type="spellStart"/>
+      <w:r>
+        <w:t>there</w:t>
+      </w:r>
+      <w:proofErr w:type="spellEnd"/>
+      <w:r>
+        <w:t xml:space="preserve"> </w:t>
+      </w:r>
+      <w:proofErr w:type="spellStart"/>
+      <w:r>
+        <w:t>will</w:t>
+      </w:r>
+      <w:proofErr w:type="spellEnd"/>
+      <w:r>
+        <w:t xml:space="preserve"> be </w:t>
+      </w:r>
+      <w:proofErr w:type="spellStart"/>
+      <w:r>
+        <w:t>additional</w:t>
+      </w:r>
+      <w:proofErr w:type="spellEnd"/>
+      <w:r>
+        <w:t xml:space="preserve"> </w:t>
+      </w:r>
+      <w:proofErr w:type="spellStart"/>
+      <w:r>
+        <w:t>space</w:t>
+      </w:r>
+      <w:proofErr w:type="spellEnd"/>
+      <w:r>
+        <w:t xml:space="preserve"> in </w:t>
+      </w:r>
+      <w:proofErr w:type="spellStart"/>
+      <w:r>
+        <w:t>packets</w:t>
+      </w:r>
+      <w:proofErr w:type="spellEnd"/>
+      <w:r>
+        <w:t xml:space="preserve"> </w:t>
+      </w:r>
+      <w:proofErr w:type="spellStart"/>
+      <w:r>
+        <w:t>to</w:t>
+      </w:r>
+      <w:proofErr w:type="spellEnd"/>
+      <w:r>
+        <w:t xml:space="preserve"> </w:t>
+      </w:r>
+      <w:proofErr w:type="spellStart"/>
+      <w:r>
+        <w:t>have</w:t>
+      </w:r>
+      <w:proofErr w:type="spellEnd"/>
+      <w:r>
+        <w:t xml:space="preserve"> </w:t>
+      </w:r>
+      <w:proofErr w:type="spellStart"/>
+      <w:r>
+        <w:t>pure</w:t>
+      </w:r>
+      <w:proofErr w:type="spellEnd"/>
+      <w:r>
+        <w:t xml:space="preserve"> </w:t>
+      </w:r>
+      <w:proofErr w:type="spellStart"/>
+      <w:r>
+        <w:t>data</w:t>
+      </w:r>
+      <w:proofErr w:type="spellEnd"/>
+      <w:r>
+        <w:t xml:space="preserve"> </w:t>
+      </w:r>
+      <w:proofErr w:type="spellStart"/>
+      <w:r>
+        <w:t>as</w:t>
+      </w:r>
+      <w:proofErr w:type="spellEnd"/>
+      <w:r>
+        <w:t xml:space="preserve"> </w:t>
+      </w:r>
+      <w:proofErr w:type="spellStart"/>
+      <w:r>
+        <w:t>well</w:t>
+      </w:r>
+      <w:proofErr w:type="spellEnd"/>
+    </w:p>
+    <w:p>
+      <w:pPr>
+        <w:pStyle w:val="ListParagraph"/>
+        <w:numPr>
+          <w:ilvl w:val="0"/>
+          <w:numId w:val="11"/>
+        </w:numPr>
+      </w:pPr>
+      <w:proofErr w:type="spellStart"/>
+      <w:r>
+        <w:t>protocols</w:t>
+      </w:r>
+      <w:proofErr w:type="spellEnd"/>
+      <w:r>
+        <w:t xml:space="preserve"> </w:t>
+      </w:r>
+      <w:proofErr w:type="spellStart"/>
+      <w:r>
+        <w:t>that</w:t>
+      </w:r>
+      <w:proofErr w:type="spellEnd"/>
+      <w:r>
+        <w:t xml:space="preserve"> </w:t>
+      </w:r>
+      <w:proofErr w:type="spellStart"/>
+      <w:r>
+        <w:t>have</w:t>
+      </w:r>
+      <w:proofErr w:type="spellEnd"/>
+      <w:r>
+        <w:t xml:space="preserve"> </w:t>
+      </w:r>
+      <w:proofErr w:type="spellStart"/>
+      <w:r>
+        <w:t>other</w:t>
+      </w:r>
+      <w:proofErr w:type="spellEnd"/>
+      <w:r>
+        <w:t xml:space="preserve"> </w:t>
+      </w:r>
+      <w:proofErr w:type="spellStart"/>
+      <w:r>
+        <w:t>protocols</w:t>
+      </w:r>
+      <w:proofErr w:type="spellEnd"/>
+      <w:r>
+        <w:t xml:space="preserve"> </w:t>
+      </w:r>
+      <w:proofErr w:type="spellStart"/>
+      <w:r>
+        <w:t>layered</w:t>
+      </w:r>
+      <w:proofErr w:type="spellEnd"/>
+      <w:r>
+        <w:t xml:space="preserve"> </w:t>
+      </w:r>
+      <w:proofErr w:type="spellStart"/>
+      <w:r>
+        <w:t>into</w:t>
+      </w:r>
+      <w:proofErr w:type="spellEnd"/>
+      <w:r>
+        <w:t xml:space="preserve"> </w:t>
+      </w:r>
+      <w:proofErr w:type="spellStart"/>
+      <w:r>
+        <w:t>them</w:t>
+      </w:r>
+      <w:proofErr w:type="spellEnd"/>
+      <w:r>
+        <w:t xml:space="preserve"> </w:t>
+      </w:r>
+      <w:proofErr w:type="spellStart"/>
+      <w:r>
+        <w:t>can</w:t>
+      </w:r>
+      <w:proofErr w:type="spellEnd"/>
+      <w:r>
+        <w:t xml:space="preserve"> </w:t>
+      </w:r>
+      <w:proofErr w:type="spellStart"/>
+      <w:r>
+        <w:t>this</w:t>
+      </w:r>
+      <w:proofErr w:type="spellEnd"/>
+      <w:r>
+        <w:t xml:space="preserve"> </w:t>
+      </w:r>
+      <w:proofErr w:type="spellStart"/>
+      <w:r>
+        <w:t>way</w:t>
+      </w:r>
+      <w:proofErr w:type="spellEnd"/>
+      <w:r>
+        <w:t xml:space="preserve"> </w:t>
+      </w:r>
+      <w:proofErr w:type="spellStart"/>
+      <w:r>
+        <w:t>refer</w:t>
+      </w:r>
+      <w:proofErr w:type="spellEnd"/>
+      <w:r>
+        <w:t xml:space="preserve"> </w:t>
+      </w:r>
+      <w:proofErr w:type="spellStart"/>
+      <w:r>
+        <w:t>to</w:t>
+      </w:r>
+      <w:proofErr w:type="spellEnd"/>
+      <w:r>
+        <w:t xml:space="preserve"> </w:t>
+      </w:r>
+      <w:proofErr w:type="spellStart"/>
+      <w:r>
+        <w:t>the</w:t>
+      </w:r>
+      <w:proofErr w:type="spellEnd"/>
+      <w:r>
+        <w:t xml:space="preserve"> </w:t>
+      </w:r>
+      <w:proofErr w:type="spellStart"/>
+      <w:r>
+        <w:t>specific</w:t>
+      </w:r>
+      <w:proofErr w:type="spellEnd"/>
+      <w:r>
+        <w:t xml:space="preserve"> </w:t>
+      </w:r>
+      <w:proofErr w:type="spellStart"/>
+      <w:r>
+        <w:t>parameters</w:t>
+      </w:r>
+      <w:proofErr w:type="spellEnd"/>
+      <w:r>
+        <w:t xml:space="preserve"> of </w:t>
+      </w:r>
+      <w:proofErr w:type="spellStart"/>
+      <w:r>
+        <w:t>that</w:t>
+      </w:r>
+      <w:proofErr w:type="spellEnd"/>
+      <w:r>
+        <w:t xml:space="preserve"> </w:t>
+      </w:r>
+      <w:proofErr w:type="spellStart"/>
+      <w:r>
+        <w:t>layered</w:t>
+      </w:r>
+      <w:proofErr w:type="spellEnd"/>
+      <w:r>
+        <w:t xml:space="preserve"> in </w:t>
+      </w:r>
+      <w:proofErr w:type="spellStart"/>
+      <w:r>
+        <w:t>protocol</w:t>
+      </w:r>
+      <w:proofErr w:type="spellEnd"/>
+    </w:p>
+    <w:p>
+      <w:proofErr w:type="spellStart"/>
+      <w:r>
+        <w:t>Packet</w:t>
+      </w:r>
+      <w:proofErr w:type="spellEnd"/>
+      <w:r>
+        <w:t xml:space="preserve"> </w:t>
+      </w:r>
+      <w:proofErr w:type="spellStart"/>
+      <w:r>
+        <w:t>class</w:t>
+      </w:r>
+      <w:proofErr w:type="spellEnd"/>
+    </w:p>
+    <w:p>
+      <w:pPr>
+        <w:pStyle w:val="ListParagraph"/>
+        <w:numPr>
+          <w:ilvl w:val="0"/>
+          <w:numId w:val="11"/>
+        </w:numPr>
+      </w:pPr>
+      <w:r>
+        <w:t xml:space="preserve">has a </w:t>
+      </w:r>
+      <w:proofErr w:type="spellStart"/>
+      <w:r>
+        <w:t>header</w:t>
+      </w:r>
+      <w:proofErr w:type="spellEnd"/>
+      <w:r>
+        <w:t xml:space="preserve"> </w:t>
+      </w:r>
+      <w:proofErr w:type="spellStart"/>
+      <w:r>
+        <w:t>segment</w:t>
+      </w:r>
+      <w:proofErr w:type="spellEnd"/>
+    </w:p>
+    <w:p>
+      <w:pPr>
+        <w:pStyle w:val="ListParagraph"/>
+        <w:numPr>
+          <w:ilvl w:val="0"/>
+          <w:numId w:val="11"/>
+        </w:numPr>
+      </w:pPr>
+      <w:r>
+        <w:t xml:space="preserve">has a </w:t>
+      </w:r>
+      <w:proofErr w:type="spellStart"/>
+      <w:r>
+        <w:t>data</w:t>
+      </w:r>
+      <w:proofErr w:type="spellEnd"/>
+      <w:r>
+        <w:t xml:space="preserve"> </w:t>
+      </w:r>
+      <w:proofErr w:type="spellStart"/>
+      <w:r>
+        <w:t>segment</w:t>
+      </w:r>
+      <w:proofErr w:type="spellEnd"/>
+    </w:p>
     <w:sectPr>
       <w:pgSz w:w="11906" w:h="16838"/>
       <w:pgMar w:top="1417" w:right="1417" w:bottom="1417" w:left="1417" w:header="708" w:footer="708" w:gutter="0"/>
@@ -3222,6 +3815,7 @@
   <w:style w:type="character" w:default="1" w:styleId="DefaultParagraphFont">
     <w:name w:val="Default Paragraph Font"/>
     <w:uiPriority w:val="1"/>
+    <w:semiHidden/>
     <w:unhideWhenUsed/>
   </w:style>
   <w:style w:type="table" w:default="1" w:styleId="TableNormal">

</xml_diff>

<commit_message>
readme updated with resources part
</commit_message>
<xml_diff>
--- a/Mini Network Simulator with Java.docx
+++ b/Mini Network Simulator with Java.docx
@@ -36,6 +36,1641 @@
       </w:r>
       <w:proofErr w:type="spellEnd"/>
     </w:p>
+    <w:p>
+      <w:pPr>
+        <w:pStyle w:val="Heading1"/>
+      </w:pPr>
+      <w:r>
+        <w:t>UDP</w:t>
+      </w:r>
+    </w:p>
+    <w:p>
+      <w:proofErr w:type="spellStart"/>
+      <w:r>
+        <w:t>For</w:t>
+      </w:r>
+      <w:proofErr w:type="spellEnd"/>
+      <w:r>
+        <w:t xml:space="preserve"> a </w:t>
+      </w:r>
+      <w:proofErr w:type="spellStart"/>
+      <w:r>
+        <w:t>great</w:t>
+      </w:r>
+      <w:proofErr w:type="spellEnd"/>
+      <w:r>
+        <w:t xml:space="preserve"> </w:t>
+      </w:r>
+      <w:proofErr w:type="spellStart"/>
+      <w:r>
+        <w:t>guide</w:t>
+      </w:r>
+      <w:proofErr w:type="spellEnd"/>
+      <w:r>
+        <w:t xml:space="preserve"> </w:t>
+      </w:r>
+      <w:proofErr w:type="spellStart"/>
+      <w:r>
+        <w:t>on</w:t>
+      </w:r>
+      <w:proofErr w:type="spellEnd"/>
+      <w:r>
+        <w:t xml:space="preserve"> UDP </w:t>
+      </w:r>
+      <w:proofErr w:type="spellStart"/>
+      <w:r>
+        <w:t>click</w:t>
+      </w:r>
+      <w:proofErr w:type="spellEnd"/>
+      <w:r>
+        <w:t xml:space="preserve"> </w:t>
+      </w:r>
+      <w:hyperlink r:id="rId5" w:history="1">
+        <w:r>
+          <w:rPr>
+            <w:rStyle w:val="Hyperlink"/>
+          </w:rPr>
+          <w:t>here</w:t>
+        </w:r>
+      </w:hyperlink>
+      <w:r>
+        <w:t xml:space="preserve">. </w:t>
+      </w:r>
+    </w:p>
+    <w:p>
+      <w:r>
+        <w:drawing>
+          <wp:inline distT="0" distB="0" distL="0" distR="0" wp14:anchorId="154F2424" wp14:editId="423D4B42">
+            <wp:extent cx="5760720" cy="2138045"/>
+            <wp:effectExtent l="0" t="0" r="0" b="0"/>
+            <wp:docPr id="1236069510" name="Picture 1"/>
+            <wp:cNvGraphicFramePr>
+              <a:graphicFrameLocks xmlns:a="http://schemas.openxmlformats.org/drawingml/2006/main" noChangeAspect="1"/>
+            </wp:cNvGraphicFramePr>
+            <a:graphic xmlns:a="http://schemas.openxmlformats.org/drawingml/2006/main">
+              <a:graphicData uri="http://schemas.openxmlformats.org/drawingml/2006/picture">
+                <pic:pic xmlns:pic="http://schemas.openxmlformats.org/drawingml/2006/picture">
+                  <pic:nvPicPr>
+                    <pic:cNvPr id="1236069510" name=""/>
+                    <pic:cNvPicPr/>
+                  </pic:nvPicPr>
+                  <pic:blipFill>
+                    <a:blip r:embed="rId6"/>
+                    <a:stretch>
+                      <a:fillRect/>
+                    </a:stretch>
+                  </pic:blipFill>
+                  <pic:spPr>
+                    <a:xfrm>
+                      <a:off x="0" y="0"/>
+                      <a:ext cx="5760720" cy="2138045"/>
+                    </a:xfrm>
+                    <a:prstGeom prst="rect">
+                      <a:avLst/>
+                    </a:prstGeom>
+                  </pic:spPr>
+                </pic:pic>
+              </a:graphicData>
+            </a:graphic>
+          </wp:inline>
+        </w:drawing>
+      </w:r>
+    </w:p>
+    <w:p>
+      <w:proofErr w:type="spellStart"/>
+      <w:r>
+        <w:t>Ports</w:t>
+      </w:r>
+      <w:proofErr w:type="spellEnd"/>
+      <w:r>
+        <w:t xml:space="preserve">: </w:t>
+      </w:r>
+    </w:p>
+    <w:p>
+      <w:pPr>
+        <w:numPr>
+          <w:ilvl w:val="0"/>
+          <w:numId w:val="12"/>
+        </w:numPr>
+      </w:pPr>
+      <w:proofErr w:type="spellStart"/>
+      <w:r>
+        <w:rPr>
+          <w:b/>
+          <w:bCs/>
+        </w:rPr>
+        <w:t>Well-Known</w:t>
+      </w:r>
+      <w:proofErr w:type="spellEnd"/>
+      <w:r>
+        <w:rPr>
+          <w:b/>
+          <w:bCs/>
+        </w:rPr>
+        <w:t xml:space="preserve"> </w:t>
+      </w:r>
+      <w:proofErr w:type="spellStart"/>
+      <w:r>
+        <w:rPr>
+          <w:b/>
+          <w:bCs/>
+        </w:rPr>
+        <w:t>Ports</w:t>
+      </w:r>
+      <w:proofErr w:type="spellEnd"/>
+      <w:r>
+        <w:rPr>
+          <w:b/>
+          <w:bCs/>
+        </w:rPr>
+        <w:t xml:space="preserve"> (0-1023):</w:t>
+      </w:r>
+      <w:r>
+        <w:t> </w:t>
+      </w:r>
+      <w:proofErr w:type="spellStart"/>
+      <w:r>
+        <w:t>Reserved</w:t>
+      </w:r>
+      <w:proofErr w:type="spellEnd"/>
+      <w:r>
+        <w:t xml:space="preserve"> </w:t>
+      </w:r>
+      <w:proofErr w:type="spellStart"/>
+      <w:r>
+        <w:t>for</w:t>
+      </w:r>
+      <w:proofErr w:type="spellEnd"/>
+      <w:r>
+        <w:t xml:space="preserve"> standard </w:t>
+      </w:r>
+      <w:proofErr w:type="spellStart"/>
+      <w:r>
+        <w:t>protocols</w:t>
+      </w:r>
+      <w:proofErr w:type="spellEnd"/>
+      <w:r>
+        <w:t xml:space="preserve"> like DNS (port 53), DHCP (</w:t>
+      </w:r>
+      <w:proofErr w:type="spellStart"/>
+      <w:r>
+        <w:t>ports</w:t>
+      </w:r>
+      <w:proofErr w:type="spellEnd"/>
+      <w:r>
+        <w:t xml:space="preserve"> 67/68), and NTP (port 123).</w:t>
+      </w:r>
+    </w:p>
+    <w:p>
+      <w:pPr>
+        <w:numPr>
+          <w:ilvl w:val="0"/>
+          <w:numId w:val="12"/>
+        </w:numPr>
+      </w:pPr>
+      <w:proofErr w:type="spellStart"/>
+      <w:r>
+        <w:rPr>
+          <w:b/>
+          <w:bCs/>
+        </w:rPr>
+        <w:t>Registered</w:t>
+      </w:r>
+      <w:proofErr w:type="spellEnd"/>
+      <w:r>
+        <w:rPr>
+          <w:b/>
+          <w:bCs/>
+        </w:rPr>
+        <w:t xml:space="preserve"> </w:t>
+      </w:r>
+      <w:proofErr w:type="spellStart"/>
+      <w:r>
+        <w:rPr>
+          <w:b/>
+          <w:bCs/>
+        </w:rPr>
+        <w:t>Ports</w:t>
+      </w:r>
+      <w:proofErr w:type="spellEnd"/>
+      <w:r>
+        <w:rPr>
+          <w:b/>
+          <w:bCs/>
+        </w:rPr>
+        <w:t xml:space="preserve"> (1024-49151):</w:t>
+      </w:r>
+      <w:r>
+        <w:t> </w:t>
+      </w:r>
+      <w:proofErr w:type="spellStart"/>
+      <w:r>
+        <w:t>Assigned</w:t>
+      </w:r>
+      <w:proofErr w:type="spellEnd"/>
+      <w:r>
+        <w:t xml:space="preserve"> </w:t>
+      </w:r>
+      <w:proofErr w:type="spellStart"/>
+      <w:r>
+        <w:t>for</w:t>
+      </w:r>
+      <w:proofErr w:type="spellEnd"/>
+      <w:r>
+        <w:t xml:space="preserve"> </w:t>
+      </w:r>
+      <w:proofErr w:type="spellStart"/>
+      <w:r>
+        <w:t>specific</w:t>
+      </w:r>
+      <w:proofErr w:type="spellEnd"/>
+      <w:r>
+        <w:t xml:space="preserve"> </w:t>
+      </w:r>
+      <w:proofErr w:type="spellStart"/>
+      <w:r>
+        <w:t>services</w:t>
+      </w:r>
+      <w:proofErr w:type="spellEnd"/>
+      <w:r>
+        <w:t xml:space="preserve"> </w:t>
+      </w:r>
+      <w:proofErr w:type="spellStart"/>
+      <w:r>
+        <w:t>or</w:t>
+      </w:r>
+      <w:proofErr w:type="spellEnd"/>
+      <w:r>
+        <w:t xml:space="preserve"> </w:t>
+      </w:r>
+      <w:proofErr w:type="spellStart"/>
+      <w:r>
+        <w:t>applications</w:t>
+      </w:r>
+      <w:proofErr w:type="spellEnd"/>
+      <w:r>
+        <w:t>.</w:t>
+      </w:r>
+      <w:r>
+        <w:t xml:space="preserve"> – </w:t>
+      </w:r>
+      <w:proofErr w:type="spellStart"/>
+      <w:r>
+        <w:t>we’ll</w:t>
+      </w:r>
+      <w:proofErr w:type="spellEnd"/>
+      <w:r>
+        <w:t xml:space="preserve"> </w:t>
+      </w:r>
+      <w:proofErr w:type="spellStart"/>
+      <w:r>
+        <w:t>assign</w:t>
+      </w:r>
+      <w:proofErr w:type="spellEnd"/>
+      <w:r>
+        <w:t xml:space="preserve"> </w:t>
+      </w:r>
+      <w:proofErr w:type="spellStart"/>
+      <w:r>
+        <w:t>these</w:t>
+      </w:r>
+      <w:proofErr w:type="spellEnd"/>
+    </w:p>
+    <w:p>
+      <w:pPr>
+        <w:numPr>
+          <w:ilvl w:val="0"/>
+          <w:numId w:val="12"/>
+        </w:numPr>
+      </w:pPr>
+      <w:proofErr w:type="spellStart"/>
+      <w:r>
+        <w:rPr>
+          <w:b/>
+          <w:bCs/>
+        </w:rPr>
+        <w:t>Dynamic</w:t>
+      </w:r>
+      <w:proofErr w:type="spellEnd"/>
+      <w:r>
+        <w:rPr>
+          <w:b/>
+          <w:bCs/>
+        </w:rPr>
+        <w:t>/</w:t>
+      </w:r>
+      <w:proofErr w:type="spellStart"/>
+      <w:r>
+        <w:rPr>
+          <w:b/>
+          <w:bCs/>
+        </w:rPr>
+        <w:t>Private</w:t>
+      </w:r>
+      <w:proofErr w:type="spellEnd"/>
+      <w:r>
+        <w:rPr>
+          <w:b/>
+          <w:bCs/>
+        </w:rPr>
+        <w:t xml:space="preserve"> </w:t>
+      </w:r>
+      <w:proofErr w:type="spellStart"/>
+      <w:r>
+        <w:rPr>
+          <w:b/>
+          <w:bCs/>
+        </w:rPr>
+        <w:t>Ports</w:t>
+      </w:r>
+      <w:proofErr w:type="spellEnd"/>
+      <w:r>
+        <w:rPr>
+          <w:b/>
+          <w:bCs/>
+        </w:rPr>
+        <w:t xml:space="preserve"> (49152-65535):</w:t>
+      </w:r>
+      <w:r>
+        <w:t> </w:t>
+      </w:r>
+      <w:proofErr w:type="spellStart"/>
+      <w:r>
+        <w:t>Used</w:t>
+      </w:r>
+      <w:proofErr w:type="spellEnd"/>
+      <w:r>
+        <w:t xml:space="preserve"> </w:t>
+      </w:r>
+      <w:proofErr w:type="spellStart"/>
+      <w:r>
+        <w:t>temporarily</w:t>
+      </w:r>
+      <w:proofErr w:type="spellEnd"/>
+      <w:r>
+        <w:t xml:space="preserve"> </w:t>
+      </w:r>
+      <w:proofErr w:type="spellStart"/>
+      <w:r>
+        <w:t>by</w:t>
+      </w:r>
+      <w:proofErr w:type="spellEnd"/>
+      <w:r>
+        <w:t xml:space="preserve"> </w:t>
+      </w:r>
+      <w:proofErr w:type="spellStart"/>
+      <w:r>
+        <w:t>applications</w:t>
+      </w:r>
+      <w:proofErr w:type="spellEnd"/>
+      <w:r>
+        <w:t xml:space="preserve"> </w:t>
+      </w:r>
+      <w:proofErr w:type="spellStart"/>
+      <w:r>
+        <w:t>for</w:t>
+      </w:r>
+      <w:proofErr w:type="spellEnd"/>
+      <w:r>
+        <w:t xml:space="preserve"> </w:t>
+      </w:r>
+      <w:proofErr w:type="spellStart"/>
+      <w:r>
+        <w:t>short-lived</w:t>
+      </w:r>
+      <w:proofErr w:type="spellEnd"/>
+      <w:r>
+        <w:t xml:space="preserve"> </w:t>
+      </w:r>
+      <w:proofErr w:type="spellStart"/>
+      <w:r>
+        <w:t>connections</w:t>
+      </w:r>
+      <w:proofErr w:type="spellEnd"/>
+      <w:r>
+        <w:t xml:space="preserve">, </w:t>
+      </w:r>
+      <w:proofErr w:type="spellStart"/>
+      <w:r>
+        <w:t>often</w:t>
+      </w:r>
+      <w:proofErr w:type="spellEnd"/>
+      <w:r>
+        <w:t xml:space="preserve"> </w:t>
+      </w:r>
+      <w:proofErr w:type="spellStart"/>
+      <w:r>
+        <w:t>for</w:t>
+      </w:r>
+      <w:proofErr w:type="spellEnd"/>
+      <w:r>
+        <w:t xml:space="preserve"> </w:t>
+      </w:r>
+      <w:proofErr w:type="spellStart"/>
+      <w:r>
+        <w:t>internal</w:t>
+      </w:r>
+      <w:proofErr w:type="spellEnd"/>
+      <w:r>
+        <w:t xml:space="preserve"> </w:t>
+      </w:r>
+      <w:proofErr w:type="spellStart"/>
+      <w:r>
+        <w:t>communication</w:t>
+      </w:r>
+      <w:proofErr w:type="spellEnd"/>
+      <w:r>
+        <w:t>.</w:t>
+      </w:r>
+    </w:p>
+    <w:p>
+      <w:pPr>
+        <w:pStyle w:val="Heading2"/>
+      </w:pPr>
+      <w:r>
+        <w:t xml:space="preserve">IP </w:t>
+      </w:r>
+      <w:proofErr w:type="spellStart"/>
+      <w:r>
+        <w:t>Layer</w:t>
+      </w:r>
+      <w:proofErr w:type="spellEnd"/>
+      <w:r>
+        <w:t xml:space="preserve"> </w:t>
+      </w:r>
+      <w:proofErr w:type="spellStart"/>
+      <w:r>
+        <w:t>Handoff</w:t>
+      </w:r>
+      <w:proofErr w:type="spellEnd"/>
+      <w:r>
+        <w:t xml:space="preserve"> &amp; Link </w:t>
+      </w:r>
+      <w:proofErr w:type="spellStart"/>
+      <w:r>
+        <w:t>Layer</w:t>
+      </w:r>
+      <w:proofErr w:type="spellEnd"/>
+      <w:r>
+        <w:t xml:space="preserve"> </w:t>
+      </w:r>
+      <w:proofErr w:type="spellStart"/>
+      <w:r>
+        <w:t>Encapsulation</w:t>
+      </w:r>
+      <w:proofErr w:type="spellEnd"/>
+    </w:p>
+    <w:p>
+      <w:r>
+        <w:t xml:space="preserve">UDP is </w:t>
+      </w:r>
+      <w:proofErr w:type="spellStart"/>
+      <w:r>
+        <w:t>passed</w:t>
+      </w:r>
+      <w:proofErr w:type="spellEnd"/>
+      <w:r>
+        <w:t xml:space="preserve"> </w:t>
+      </w:r>
+      <w:proofErr w:type="spellStart"/>
+      <w:r>
+        <w:t>to</w:t>
+      </w:r>
+      <w:proofErr w:type="spellEnd"/>
+      <w:r>
+        <w:t xml:space="preserve"> </w:t>
+      </w:r>
+      <w:proofErr w:type="spellStart"/>
+      <w:r>
+        <w:t>the</w:t>
+      </w:r>
+      <w:proofErr w:type="spellEnd"/>
+      <w:r>
+        <w:t xml:space="preserve"> IP </w:t>
+      </w:r>
+      <w:proofErr w:type="spellStart"/>
+      <w:r>
+        <w:t>layer</w:t>
+      </w:r>
+      <w:proofErr w:type="spellEnd"/>
+      <w:r>
+        <w:t xml:space="preserve">, </w:t>
+      </w:r>
+      <w:proofErr w:type="spellStart"/>
+      <w:r>
+        <w:t>which</w:t>
+      </w:r>
+      <w:proofErr w:type="spellEnd"/>
+      <w:r>
+        <w:t xml:space="preserve"> </w:t>
+      </w:r>
+      <w:proofErr w:type="spellStart"/>
+      <w:r>
+        <w:t>adds</w:t>
+      </w:r>
+      <w:proofErr w:type="spellEnd"/>
+      <w:r>
+        <w:t xml:space="preserve"> </w:t>
+      </w:r>
+      <w:proofErr w:type="spellStart"/>
+      <w:r>
+        <w:t>its</w:t>
+      </w:r>
+      <w:proofErr w:type="spellEnd"/>
+      <w:r>
+        <w:t xml:space="preserve"> </w:t>
+      </w:r>
+      <w:proofErr w:type="spellStart"/>
+      <w:r>
+        <w:t>own</w:t>
+      </w:r>
+      <w:proofErr w:type="spellEnd"/>
+      <w:r>
+        <w:t xml:space="preserve"> </w:t>
+      </w:r>
+      <w:proofErr w:type="spellStart"/>
+      <w:r>
+        <w:t>header</w:t>
+      </w:r>
+      <w:proofErr w:type="spellEnd"/>
+      <w:r>
+        <w:t xml:space="preserve"> </w:t>
+      </w:r>
+      <w:proofErr w:type="spellStart"/>
+      <w:r>
+        <w:t>containing</w:t>
+      </w:r>
+      <w:proofErr w:type="spellEnd"/>
+      <w:r>
+        <w:t xml:space="preserve"> </w:t>
+      </w:r>
+      <w:proofErr w:type="spellStart"/>
+      <w:r>
+        <w:t>source</w:t>
+      </w:r>
+      <w:proofErr w:type="spellEnd"/>
+      <w:r>
+        <w:t xml:space="preserve"> and </w:t>
+      </w:r>
+      <w:proofErr w:type="spellStart"/>
+      <w:r>
+        <w:t>derstination</w:t>
+      </w:r>
+      <w:proofErr w:type="spellEnd"/>
+      <w:r>
+        <w:t xml:space="preserve"> IP </w:t>
+      </w:r>
+      <w:proofErr w:type="spellStart"/>
+      <w:r>
+        <w:t>addresses</w:t>
+      </w:r>
+      <w:proofErr w:type="spellEnd"/>
+      <w:r>
+        <w:t xml:space="preserve">. </w:t>
+      </w:r>
+      <w:proofErr w:type="spellStart"/>
+      <w:r>
+        <w:t>This</w:t>
+      </w:r>
+      <w:proofErr w:type="spellEnd"/>
+      <w:r>
+        <w:t xml:space="preserve"> </w:t>
+      </w:r>
+      <w:proofErr w:type="spellStart"/>
+      <w:r>
+        <w:t>enables</w:t>
+      </w:r>
+      <w:proofErr w:type="spellEnd"/>
+      <w:r>
+        <w:t xml:space="preserve"> </w:t>
+      </w:r>
+      <w:proofErr w:type="spellStart"/>
+      <w:r>
+        <w:t>the</w:t>
+      </w:r>
+      <w:proofErr w:type="spellEnd"/>
+      <w:r>
+        <w:t xml:space="preserve"> UDP </w:t>
+      </w:r>
+      <w:proofErr w:type="spellStart"/>
+      <w:r>
+        <w:t>packet</w:t>
+      </w:r>
+      <w:proofErr w:type="spellEnd"/>
+      <w:r>
+        <w:t xml:space="preserve"> </w:t>
+      </w:r>
+      <w:proofErr w:type="spellStart"/>
+      <w:r>
+        <w:t>to</w:t>
+      </w:r>
+      <w:proofErr w:type="spellEnd"/>
+      <w:r>
+        <w:t xml:space="preserve"> be </w:t>
+      </w:r>
+      <w:proofErr w:type="spellStart"/>
+      <w:r>
+        <w:t>routed</w:t>
+      </w:r>
+      <w:proofErr w:type="spellEnd"/>
+      <w:r>
+        <w:t xml:space="preserve"> tot he </w:t>
+      </w:r>
+      <w:proofErr w:type="spellStart"/>
+      <w:r>
+        <w:t>correct</w:t>
+      </w:r>
+      <w:proofErr w:type="spellEnd"/>
+      <w:r>
+        <w:t xml:space="preserve"> </w:t>
+      </w:r>
+      <w:proofErr w:type="spellStart"/>
+      <w:r>
+        <w:t>destination</w:t>
+      </w:r>
+      <w:proofErr w:type="spellEnd"/>
+      <w:r>
+        <w:t xml:space="preserve"> over </w:t>
+      </w:r>
+      <w:proofErr w:type="spellStart"/>
+      <w:r>
+        <w:t>the</w:t>
+      </w:r>
+      <w:proofErr w:type="spellEnd"/>
+      <w:r>
+        <w:t xml:space="preserve"> </w:t>
+      </w:r>
+      <w:proofErr w:type="spellStart"/>
+      <w:r>
+        <w:t>network</w:t>
+      </w:r>
+      <w:proofErr w:type="spellEnd"/>
+      <w:r>
+        <w:t xml:space="preserve">. The IP </w:t>
+      </w:r>
+      <w:proofErr w:type="spellStart"/>
+      <w:r>
+        <w:t>layer</w:t>
+      </w:r>
+      <w:proofErr w:type="spellEnd"/>
+      <w:r>
+        <w:t xml:space="preserve"> is </w:t>
+      </w:r>
+      <w:proofErr w:type="spellStart"/>
+      <w:r>
+        <w:t>responsible</w:t>
+      </w:r>
+      <w:proofErr w:type="spellEnd"/>
+      <w:r>
+        <w:t xml:space="preserve"> </w:t>
+      </w:r>
+      <w:proofErr w:type="spellStart"/>
+      <w:r>
+        <w:t>for</w:t>
+      </w:r>
+      <w:proofErr w:type="spellEnd"/>
+      <w:r>
+        <w:t xml:space="preserve"> </w:t>
+      </w:r>
+      <w:proofErr w:type="spellStart"/>
+      <w:r>
+        <w:t>packet</w:t>
+      </w:r>
+      <w:proofErr w:type="spellEnd"/>
+      <w:r>
+        <w:t xml:space="preserve"> </w:t>
+      </w:r>
+      <w:proofErr w:type="spellStart"/>
+      <w:r>
+        <w:t>routing</w:t>
+      </w:r>
+      <w:proofErr w:type="spellEnd"/>
+      <w:r>
+        <w:t xml:space="preserve"> and </w:t>
+      </w:r>
+      <w:proofErr w:type="spellStart"/>
+      <w:r>
+        <w:t>once</w:t>
+      </w:r>
+      <w:proofErr w:type="spellEnd"/>
+      <w:r>
+        <w:t xml:space="preserve"> </w:t>
+      </w:r>
+      <w:proofErr w:type="spellStart"/>
+      <w:r>
+        <w:t>the</w:t>
+      </w:r>
+      <w:proofErr w:type="spellEnd"/>
+      <w:r>
+        <w:t xml:space="preserve"> IP </w:t>
+      </w:r>
+      <w:proofErr w:type="spellStart"/>
+      <w:r>
+        <w:t>header</w:t>
+      </w:r>
+      <w:proofErr w:type="spellEnd"/>
+      <w:r>
+        <w:t xml:space="preserve"> is </w:t>
+      </w:r>
+      <w:proofErr w:type="spellStart"/>
+      <w:r>
+        <w:t>adderd</w:t>
+      </w:r>
+      <w:proofErr w:type="spellEnd"/>
+      <w:r>
+        <w:t xml:space="preserve">, </w:t>
+      </w:r>
+      <w:proofErr w:type="spellStart"/>
+      <w:r>
+        <w:t>the</w:t>
+      </w:r>
+      <w:proofErr w:type="spellEnd"/>
+      <w:r>
+        <w:t xml:space="preserve"> </w:t>
+      </w:r>
+      <w:proofErr w:type="spellStart"/>
+      <w:r>
+        <w:t>entire</w:t>
+      </w:r>
+      <w:proofErr w:type="spellEnd"/>
+      <w:r>
+        <w:t xml:space="preserve"> </w:t>
+      </w:r>
+      <w:proofErr w:type="spellStart"/>
+      <w:r>
+        <w:t>packet</w:t>
+      </w:r>
+      <w:proofErr w:type="spellEnd"/>
+      <w:r>
+        <w:t xml:space="preserve"> is </w:t>
+      </w:r>
+      <w:proofErr w:type="spellStart"/>
+      <w:r>
+        <w:t>encapsulated</w:t>
+      </w:r>
+      <w:proofErr w:type="spellEnd"/>
+      <w:r>
+        <w:t xml:space="preserve"> </w:t>
+      </w:r>
+      <w:proofErr w:type="spellStart"/>
+      <w:r>
+        <w:t>into</w:t>
+      </w:r>
+      <w:proofErr w:type="spellEnd"/>
+      <w:r>
+        <w:t xml:space="preserve"> a link-</w:t>
+      </w:r>
+      <w:proofErr w:type="spellStart"/>
+      <w:r>
+        <w:t>layer</w:t>
+      </w:r>
+      <w:proofErr w:type="spellEnd"/>
+      <w:r>
+        <w:t xml:space="preserve"> </w:t>
+      </w:r>
+      <w:proofErr w:type="spellStart"/>
+      <w:r>
+        <w:t>frame</w:t>
+      </w:r>
+      <w:proofErr w:type="spellEnd"/>
+      <w:r>
+        <w:t xml:space="preserve"> (Ethernet/</w:t>
+      </w:r>
+      <w:proofErr w:type="spellStart"/>
+      <w:r>
+        <w:t>Wi</w:t>
+      </w:r>
+      <w:proofErr w:type="spellEnd"/>
+      <w:r>
+        <w:t xml:space="preserve">-fi) </w:t>
+      </w:r>
+      <w:proofErr w:type="spellStart"/>
+      <w:r>
+        <w:t>for</w:t>
+      </w:r>
+      <w:proofErr w:type="spellEnd"/>
+      <w:r>
+        <w:t xml:space="preserve"> </w:t>
+      </w:r>
+      <w:proofErr w:type="spellStart"/>
+      <w:r>
+        <w:t>transmission</w:t>
+      </w:r>
+      <w:proofErr w:type="spellEnd"/>
+      <w:r>
+        <w:t xml:space="preserve"> over </w:t>
+      </w:r>
+      <w:proofErr w:type="spellStart"/>
+      <w:r>
+        <w:t>the</w:t>
+      </w:r>
+      <w:proofErr w:type="spellEnd"/>
+      <w:r>
+        <w:t xml:space="preserve"> </w:t>
+      </w:r>
+      <w:proofErr w:type="spellStart"/>
+      <w:r>
+        <w:t>physical</w:t>
+      </w:r>
+      <w:proofErr w:type="spellEnd"/>
+      <w:r>
+        <w:t xml:space="preserve"> </w:t>
+      </w:r>
+      <w:proofErr w:type="spellStart"/>
+      <w:r>
+        <w:t>network</w:t>
+      </w:r>
+      <w:proofErr w:type="spellEnd"/>
+      <w:r>
+        <w:t xml:space="preserve">. </w:t>
+      </w:r>
+      <w:proofErr w:type="spellStart"/>
+      <w:r>
+        <w:t>This</w:t>
+      </w:r>
+      <w:proofErr w:type="spellEnd"/>
+      <w:r>
+        <w:t xml:space="preserve"> </w:t>
+      </w:r>
+      <w:proofErr w:type="spellStart"/>
+      <w:r>
+        <w:t>allows</w:t>
+      </w:r>
+      <w:proofErr w:type="spellEnd"/>
+      <w:r>
+        <w:t xml:space="preserve"> </w:t>
+      </w:r>
+      <w:proofErr w:type="spellStart"/>
+      <w:r>
+        <w:t>the</w:t>
+      </w:r>
+      <w:proofErr w:type="spellEnd"/>
+      <w:r>
+        <w:t xml:space="preserve"> </w:t>
+      </w:r>
+      <w:proofErr w:type="spellStart"/>
+      <w:r>
+        <w:t>data</w:t>
+      </w:r>
+      <w:proofErr w:type="spellEnd"/>
+      <w:r>
+        <w:t xml:space="preserve"> </w:t>
+      </w:r>
+      <w:proofErr w:type="spellStart"/>
+      <w:r>
+        <w:t>to</w:t>
+      </w:r>
+      <w:proofErr w:type="spellEnd"/>
+      <w:r>
+        <w:t xml:space="preserve"> </w:t>
+      </w:r>
+      <w:proofErr w:type="spellStart"/>
+      <w:r>
+        <w:t>travel</w:t>
+      </w:r>
+      <w:proofErr w:type="spellEnd"/>
+      <w:r>
+        <w:t xml:space="preserve"> </w:t>
+      </w:r>
+      <w:proofErr w:type="spellStart"/>
+      <w:r>
+        <w:t>across</w:t>
+      </w:r>
+      <w:proofErr w:type="spellEnd"/>
+      <w:r>
+        <w:t xml:space="preserve"> </w:t>
+      </w:r>
+      <w:proofErr w:type="spellStart"/>
+      <w:r>
+        <w:t>various</w:t>
+      </w:r>
+      <w:proofErr w:type="spellEnd"/>
+      <w:r>
+        <w:t xml:space="preserve"> </w:t>
+      </w:r>
+      <w:proofErr w:type="spellStart"/>
+      <w:r>
+        <w:t>routers</w:t>
+      </w:r>
+      <w:proofErr w:type="spellEnd"/>
+      <w:r>
+        <w:t xml:space="preserve"> and </w:t>
+      </w:r>
+      <w:proofErr w:type="spellStart"/>
+      <w:r>
+        <w:t>network</w:t>
+      </w:r>
+      <w:proofErr w:type="spellEnd"/>
+      <w:r>
+        <w:t xml:space="preserve"> </w:t>
+      </w:r>
+      <w:proofErr w:type="spellStart"/>
+      <w:r>
+        <w:t>segments</w:t>
+      </w:r>
+      <w:proofErr w:type="spellEnd"/>
+      <w:r>
+        <w:t xml:space="preserve"> </w:t>
+      </w:r>
+      <w:proofErr w:type="spellStart"/>
+      <w:r>
+        <w:t>on</w:t>
+      </w:r>
+      <w:proofErr w:type="spellEnd"/>
+      <w:r>
+        <w:t xml:space="preserve"> </w:t>
+      </w:r>
+      <w:proofErr w:type="spellStart"/>
+      <w:r>
+        <w:t>its</w:t>
+      </w:r>
+      <w:proofErr w:type="spellEnd"/>
+      <w:r>
+        <w:t xml:space="preserve"> </w:t>
+      </w:r>
+      <w:proofErr w:type="spellStart"/>
+      <w:r>
+        <w:t>way</w:t>
+      </w:r>
+      <w:proofErr w:type="spellEnd"/>
+      <w:r>
+        <w:t xml:space="preserve"> </w:t>
+      </w:r>
+      <w:proofErr w:type="spellStart"/>
+      <w:r>
+        <w:t>to</w:t>
+      </w:r>
+      <w:proofErr w:type="spellEnd"/>
+      <w:r>
+        <w:t xml:space="preserve"> </w:t>
+      </w:r>
+      <w:proofErr w:type="spellStart"/>
+      <w:r>
+        <w:t>the</w:t>
+      </w:r>
+      <w:proofErr w:type="spellEnd"/>
+      <w:r>
+        <w:t xml:space="preserve"> </w:t>
+      </w:r>
+      <w:proofErr w:type="spellStart"/>
+      <w:r>
+        <w:t>destination</w:t>
+      </w:r>
+      <w:proofErr w:type="spellEnd"/>
+      <w:r>
+        <w:t xml:space="preserve">. </w:t>
+      </w:r>
+    </w:p>
+    <w:p>
+      <w:pPr>
+        <w:pStyle w:val="Heading2"/>
+      </w:pPr>
+      <w:r>
+        <w:t xml:space="preserve">UDP </w:t>
+      </w:r>
+      <w:proofErr w:type="spellStart"/>
+      <w:r>
+        <w:t>Layer</w:t>
+      </w:r>
+      <w:proofErr w:type="spellEnd"/>
+      <w:r>
+        <w:t xml:space="preserve"> </w:t>
+      </w:r>
+      <w:proofErr w:type="spellStart"/>
+      <w:r>
+        <w:t>Processing</w:t>
+      </w:r>
+      <w:proofErr w:type="spellEnd"/>
+      <w:r>
+        <w:t xml:space="preserve"> &amp; Reception</w:t>
+      </w:r>
+    </w:p>
+    <w:p>
+      <w:proofErr w:type="spellStart"/>
+      <w:r>
+        <w:t>Upon</w:t>
+      </w:r>
+      <w:proofErr w:type="spellEnd"/>
+      <w:r>
+        <w:t xml:space="preserve"> </w:t>
+      </w:r>
+      <w:proofErr w:type="spellStart"/>
+      <w:r>
+        <w:t>reaching</w:t>
+      </w:r>
+      <w:proofErr w:type="spellEnd"/>
+      <w:r>
+        <w:t xml:space="preserve"> </w:t>
+      </w:r>
+      <w:proofErr w:type="spellStart"/>
+      <w:r>
+        <w:t>the</w:t>
+      </w:r>
+      <w:proofErr w:type="spellEnd"/>
+      <w:r>
+        <w:t xml:space="preserve"> </w:t>
+      </w:r>
+      <w:proofErr w:type="spellStart"/>
+      <w:r>
+        <w:t>destination</w:t>
+      </w:r>
+      <w:proofErr w:type="spellEnd"/>
+      <w:r>
+        <w:t xml:space="preserve"> </w:t>
+      </w:r>
+      <w:proofErr w:type="spellStart"/>
+      <w:r>
+        <w:t>the</w:t>
+      </w:r>
+      <w:proofErr w:type="spellEnd"/>
+      <w:r>
+        <w:t xml:space="preserve"> IP </w:t>
+      </w:r>
+      <w:proofErr w:type="spellStart"/>
+      <w:r>
+        <w:t>header</w:t>
+      </w:r>
+      <w:proofErr w:type="spellEnd"/>
+      <w:r>
+        <w:t xml:space="preserve"> is </w:t>
+      </w:r>
+      <w:proofErr w:type="spellStart"/>
+      <w:r>
+        <w:t>removed</w:t>
+      </w:r>
+      <w:proofErr w:type="spellEnd"/>
+      <w:r>
+        <w:t xml:space="preserve"> and </w:t>
+      </w:r>
+      <w:proofErr w:type="spellStart"/>
+      <w:r>
+        <w:t>the</w:t>
+      </w:r>
+      <w:proofErr w:type="spellEnd"/>
+      <w:r>
+        <w:t xml:space="preserve"> UDP </w:t>
+      </w:r>
+      <w:proofErr w:type="spellStart"/>
+      <w:r>
+        <w:t>datagram</w:t>
+      </w:r>
+      <w:proofErr w:type="spellEnd"/>
+      <w:r>
+        <w:t xml:space="preserve"> is </w:t>
+      </w:r>
+      <w:proofErr w:type="spellStart"/>
+      <w:r>
+        <w:t>extracted</w:t>
+      </w:r>
+      <w:proofErr w:type="spellEnd"/>
+      <w:r>
+        <w:t xml:space="preserve">. The </w:t>
+      </w:r>
+      <w:proofErr w:type="spellStart"/>
+      <w:r>
+        <w:t>recipient’s</w:t>
+      </w:r>
+      <w:proofErr w:type="spellEnd"/>
+      <w:r>
+        <w:t xml:space="preserve"> UDP </w:t>
+      </w:r>
+      <w:proofErr w:type="spellStart"/>
+      <w:r>
+        <w:t>layer</w:t>
+      </w:r>
+      <w:proofErr w:type="spellEnd"/>
+      <w:r>
+        <w:t xml:space="preserve"> </w:t>
+      </w:r>
+      <w:proofErr w:type="spellStart"/>
+      <w:r>
+        <w:t>verifies</w:t>
+      </w:r>
+      <w:proofErr w:type="spellEnd"/>
+      <w:r>
+        <w:t xml:space="preserve"> </w:t>
+      </w:r>
+      <w:proofErr w:type="spellStart"/>
+      <w:r>
+        <w:t>the</w:t>
+      </w:r>
+      <w:proofErr w:type="spellEnd"/>
+      <w:r>
+        <w:t xml:space="preserve"> </w:t>
+      </w:r>
+      <w:proofErr w:type="spellStart"/>
+      <w:r>
+        <w:t>checksum</w:t>
+      </w:r>
+      <w:proofErr w:type="spellEnd"/>
+      <w:r>
+        <w:t xml:space="preserve"> (</w:t>
+      </w:r>
+      <w:proofErr w:type="spellStart"/>
+      <w:r>
+        <w:t>if</w:t>
+      </w:r>
+      <w:proofErr w:type="spellEnd"/>
+      <w:r>
+        <w:t xml:space="preserve"> </w:t>
+      </w:r>
+      <w:proofErr w:type="spellStart"/>
+      <w:r>
+        <w:t>used</w:t>
+      </w:r>
+      <w:proofErr w:type="spellEnd"/>
+      <w:r>
+        <w:t xml:space="preserve">) </w:t>
+      </w:r>
+      <w:proofErr w:type="spellStart"/>
+      <w:r>
+        <w:t>to</w:t>
+      </w:r>
+      <w:proofErr w:type="spellEnd"/>
+      <w:r>
+        <w:t xml:space="preserve"> </w:t>
+      </w:r>
+      <w:proofErr w:type="spellStart"/>
+      <w:r>
+        <w:t>ensure</w:t>
+      </w:r>
+      <w:proofErr w:type="spellEnd"/>
+      <w:r>
+        <w:t xml:space="preserve"> </w:t>
+      </w:r>
+      <w:proofErr w:type="spellStart"/>
+      <w:r>
+        <w:t>the</w:t>
+      </w:r>
+      <w:proofErr w:type="spellEnd"/>
+      <w:r>
+        <w:t xml:space="preserve"> </w:t>
+      </w:r>
+      <w:proofErr w:type="spellStart"/>
+      <w:r>
+        <w:t>integrity</w:t>
+      </w:r>
+      <w:proofErr w:type="spellEnd"/>
+      <w:r>
+        <w:t xml:space="preserve"> of </w:t>
+      </w:r>
+      <w:proofErr w:type="spellStart"/>
+      <w:r>
+        <w:t>the</w:t>
+      </w:r>
+      <w:proofErr w:type="spellEnd"/>
+      <w:r>
+        <w:t xml:space="preserve"> </w:t>
+      </w:r>
+      <w:proofErr w:type="spellStart"/>
+      <w:r>
+        <w:t>transmitted</w:t>
+      </w:r>
+      <w:proofErr w:type="spellEnd"/>
+      <w:r>
+        <w:t xml:space="preserve"> </w:t>
+      </w:r>
+      <w:proofErr w:type="spellStart"/>
+      <w:r>
+        <w:t>data</w:t>
+      </w:r>
+      <w:proofErr w:type="spellEnd"/>
+      <w:r>
+        <w:t xml:space="preserve">. </w:t>
+      </w:r>
+      <w:proofErr w:type="spellStart"/>
+      <w:r>
+        <w:t>It</w:t>
+      </w:r>
+      <w:proofErr w:type="spellEnd"/>
+      <w:r>
+        <w:t xml:space="preserve"> </w:t>
+      </w:r>
+      <w:proofErr w:type="spellStart"/>
+      <w:r>
+        <w:t>then</w:t>
+      </w:r>
+      <w:proofErr w:type="spellEnd"/>
+      <w:r>
+        <w:t xml:space="preserve"> </w:t>
+      </w:r>
+      <w:proofErr w:type="spellStart"/>
+      <w:r>
+        <w:t>uses</w:t>
+      </w:r>
+      <w:proofErr w:type="spellEnd"/>
+      <w:r>
+        <w:t xml:space="preserve"> </w:t>
+      </w:r>
+      <w:proofErr w:type="spellStart"/>
+      <w:r>
+        <w:t>the</w:t>
+      </w:r>
+      <w:proofErr w:type="spellEnd"/>
+      <w:r>
+        <w:t xml:space="preserve"> </w:t>
+      </w:r>
+      <w:proofErr w:type="spellStart"/>
+      <w:r>
+        <w:t>destinatino</w:t>
+      </w:r>
+      <w:proofErr w:type="spellEnd"/>
+      <w:r>
+        <w:t xml:space="preserve"> port in </w:t>
+      </w:r>
+      <w:proofErr w:type="spellStart"/>
+      <w:r>
+        <w:t>the</w:t>
+      </w:r>
+      <w:proofErr w:type="spellEnd"/>
+      <w:r>
+        <w:t xml:space="preserve"> UDP </w:t>
+      </w:r>
+      <w:proofErr w:type="spellStart"/>
+      <w:r>
+        <w:t>header</w:t>
+      </w:r>
+      <w:proofErr w:type="spellEnd"/>
+      <w:r>
+        <w:t xml:space="preserve"> </w:t>
+      </w:r>
+      <w:proofErr w:type="spellStart"/>
+      <w:r>
+        <w:t>to</w:t>
+      </w:r>
+      <w:proofErr w:type="spellEnd"/>
+      <w:r>
+        <w:t xml:space="preserve"> </w:t>
+      </w:r>
+      <w:proofErr w:type="spellStart"/>
+      <w:r>
+        <w:t>identify</w:t>
+      </w:r>
+      <w:proofErr w:type="spellEnd"/>
+      <w:r>
+        <w:t xml:space="preserve"> </w:t>
+      </w:r>
+      <w:proofErr w:type="spellStart"/>
+      <w:r>
+        <w:t>the</w:t>
+      </w:r>
+      <w:proofErr w:type="spellEnd"/>
+      <w:r>
+        <w:t xml:space="preserve"> </w:t>
+      </w:r>
+      <w:proofErr w:type="spellStart"/>
+      <w:r>
+        <w:t>correct</w:t>
+      </w:r>
+      <w:proofErr w:type="spellEnd"/>
+      <w:r>
+        <w:t xml:space="preserve"> </w:t>
+      </w:r>
+      <w:proofErr w:type="spellStart"/>
+      <w:r>
+        <w:t>application</w:t>
+      </w:r>
+      <w:proofErr w:type="spellEnd"/>
+      <w:r>
+        <w:t xml:space="preserve"> </w:t>
+      </w:r>
+      <w:proofErr w:type="spellStart"/>
+      <w:r>
+        <w:t>to</w:t>
+      </w:r>
+      <w:proofErr w:type="spellEnd"/>
+      <w:r>
+        <w:t xml:space="preserve"> </w:t>
+      </w:r>
+      <w:proofErr w:type="spellStart"/>
+      <w:r>
+        <w:t>forward</w:t>
+      </w:r>
+      <w:proofErr w:type="spellEnd"/>
+      <w:r>
+        <w:t xml:space="preserve"> </w:t>
+      </w:r>
+      <w:proofErr w:type="spellStart"/>
+      <w:r>
+        <w:t>the</w:t>
+      </w:r>
+      <w:proofErr w:type="spellEnd"/>
+      <w:r>
+        <w:t xml:space="preserve"> </w:t>
+      </w:r>
+      <w:proofErr w:type="spellStart"/>
+      <w:r>
+        <w:t>data</w:t>
+      </w:r>
+      <w:proofErr w:type="spellEnd"/>
+      <w:r>
+        <w:t xml:space="preserve">. </w:t>
+      </w:r>
+      <w:proofErr w:type="spellStart"/>
+      <w:r>
+        <w:t>Since</w:t>
+      </w:r>
+      <w:proofErr w:type="spellEnd"/>
+      <w:r>
+        <w:t xml:space="preserve"> UDP </w:t>
+      </w:r>
+      <w:proofErr w:type="spellStart"/>
+      <w:r>
+        <w:t>doesn’t</w:t>
+      </w:r>
+      <w:proofErr w:type="spellEnd"/>
+      <w:r>
+        <w:t xml:space="preserve"> </w:t>
+      </w:r>
+      <w:proofErr w:type="spellStart"/>
+      <w:r>
+        <w:t>guarantee</w:t>
+      </w:r>
+      <w:proofErr w:type="spellEnd"/>
+      <w:r>
+        <w:t xml:space="preserve"> </w:t>
+      </w:r>
+      <w:proofErr w:type="spellStart"/>
+      <w:r>
+        <w:t>delivery</w:t>
+      </w:r>
+      <w:proofErr w:type="spellEnd"/>
+      <w:r>
+        <w:t xml:space="preserve"> </w:t>
+      </w:r>
+      <w:proofErr w:type="spellStart"/>
+      <w:r>
+        <w:t>or</w:t>
+      </w:r>
+      <w:proofErr w:type="spellEnd"/>
+      <w:r>
+        <w:t xml:space="preserve"> </w:t>
+      </w:r>
+      <w:proofErr w:type="spellStart"/>
+      <w:r>
+        <w:t>ordering</w:t>
+      </w:r>
+      <w:proofErr w:type="spellEnd"/>
+      <w:r>
+        <w:t xml:space="preserve"> of </w:t>
+      </w:r>
+      <w:proofErr w:type="spellStart"/>
+      <w:r>
+        <w:t>packets</w:t>
+      </w:r>
+      <w:proofErr w:type="spellEnd"/>
+      <w:r>
+        <w:t xml:space="preserve"> </w:t>
+      </w:r>
+      <w:proofErr w:type="spellStart"/>
+      <w:r>
+        <w:lastRenderedPageBreak/>
+        <w:t>it</w:t>
+      </w:r>
+      <w:proofErr w:type="spellEnd"/>
+      <w:r>
+        <w:t xml:space="preserve"> is </w:t>
+      </w:r>
+      <w:proofErr w:type="spellStart"/>
+      <w:r>
+        <w:t>up</w:t>
+      </w:r>
+      <w:proofErr w:type="spellEnd"/>
+      <w:r>
+        <w:t xml:space="preserve"> </w:t>
+      </w:r>
+      <w:proofErr w:type="spellStart"/>
+      <w:r>
+        <w:t>to</w:t>
+      </w:r>
+      <w:proofErr w:type="spellEnd"/>
+      <w:r>
+        <w:t xml:space="preserve"> </w:t>
+      </w:r>
+      <w:proofErr w:type="spellStart"/>
+      <w:r>
+        <w:t>t</w:t>
+      </w:r>
+      <w:r>
+        <w:t>he</w:t>
+      </w:r>
+      <w:proofErr w:type="spellEnd"/>
+      <w:r>
+        <w:t xml:space="preserve"> </w:t>
+      </w:r>
+      <w:proofErr w:type="spellStart"/>
+      <w:r>
+        <w:t>application</w:t>
+      </w:r>
+      <w:proofErr w:type="spellEnd"/>
+      <w:r>
+        <w:t xml:space="preserve"> </w:t>
+      </w:r>
+      <w:proofErr w:type="spellStart"/>
+      <w:r>
+        <w:t>to</w:t>
+      </w:r>
+      <w:proofErr w:type="spellEnd"/>
+      <w:r>
+        <w:t xml:space="preserve"> </w:t>
+      </w:r>
+      <w:proofErr w:type="spellStart"/>
+      <w:r>
+        <w:t>handle</w:t>
+      </w:r>
+      <w:proofErr w:type="spellEnd"/>
+      <w:r>
+        <w:t xml:space="preserve"> </w:t>
+      </w:r>
+      <w:proofErr w:type="spellStart"/>
+      <w:r>
+        <w:t>retransmission</w:t>
+      </w:r>
+      <w:proofErr w:type="spellEnd"/>
+      <w:r>
+        <w:t xml:space="preserve"> </w:t>
+      </w:r>
+      <w:proofErr w:type="spellStart"/>
+      <w:r>
+        <w:t>or</w:t>
+      </w:r>
+      <w:proofErr w:type="spellEnd"/>
+      <w:r>
+        <w:t xml:space="preserve"> </w:t>
+      </w:r>
+      <w:proofErr w:type="spellStart"/>
+      <w:r>
+        <w:t>other</w:t>
+      </w:r>
+      <w:proofErr w:type="spellEnd"/>
+      <w:r>
+        <w:t xml:space="preserve"> </w:t>
+      </w:r>
+      <w:proofErr w:type="spellStart"/>
+      <w:r>
+        <w:t>recovery</w:t>
+      </w:r>
+      <w:proofErr w:type="spellEnd"/>
+      <w:r>
+        <w:t xml:space="preserve"> </w:t>
+      </w:r>
+      <w:proofErr w:type="spellStart"/>
+      <w:r>
+        <w:t>mechanisms</w:t>
+      </w:r>
+      <w:proofErr w:type="spellEnd"/>
+      <w:r>
+        <w:t xml:space="preserve"> </w:t>
+      </w:r>
+      <w:proofErr w:type="spellStart"/>
+      <w:r>
+        <w:t>if</w:t>
+      </w:r>
+      <w:proofErr w:type="spellEnd"/>
+      <w:r>
+        <w:t xml:space="preserve"> </w:t>
+      </w:r>
+      <w:proofErr w:type="spellStart"/>
+      <w:r>
+        <w:t>needed</w:t>
+      </w:r>
+      <w:proofErr w:type="spellEnd"/>
+      <w:r>
+        <w:t xml:space="preserve">. </w:t>
+      </w:r>
+      <w:proofErr w:type="spellStart"/>
+      <w:r>
+        <w:t>Once</w:t>
+      </w:r>
+      <w:proofErr w:type="spellEnd"/>
+      <w:r>
+        <w:t xml:space="preserve"> </w:t>
+      </w:r>
+      <w:proofErr w:type="spellStart"/>
+      <w:r>
+        <w:t>processed</w:t>
+      </w:r>
+      <w:proofErr w:type="spellEnd"/>
+      <w:r>
+        <w:t xml:space="preserve">, </w:t>
+      </w:r>
+      <w:proofErr w:type="spellStart"/>
+      <w:r>
+        <w:t>the</w:t>
+      </w:r>
+      <w:proofErr w:type="spellEnd"/>
+      <w:r>
+        <w:t xml:space="preserve"> </w:t>
+      </w:r>
+      <w:proofErr w:type="spellStart"/>
+      <w:r>
+        <w:t>data</w:t>
+      </w:r>
+      <w:proofErr w:type="spellEnd"/>
+      <w:r>
+        <w:t xml:space="preserve"> is </w:t>
+      </w:r>
+      <w:proofErr w:type="spellStart"/>
+      <w:r>
+        <w:t>extracted</w:t>
+      </w:r>
+      <w:proofErr w:type="spellEnd"/>
+      <w:r>
+        <w:t xml:space="preserve"> </w:t>
+      </w:r>
+      <w:proofErr w:type="spellStart"/>
+      <w:r>
+        <w:t>from</w:t>
+      </w:r>
+      <w:proofErr w:type="spellEnd"/>
+      <w:r>
+        <w:t xml:space="preserve"> </w:t>
+      </w:r>
+      <w:proofErr w:type="spellStart"/>
+      <w:r>
+        <w:t>the</w:t>
+      </w:r>
+      <w:proofErr w:type="spellEnd"/>
+      <w:r>
+        <w:t xml:space="preserve"> UDP </w:t>
+      </w:r>
+      <w:proofErr w:type="spellStart"/>
+      <w:r>
+        <w:t>datagram</w:t>
+      </w:r>
+      <w:proofErr w:type="spellEnd"/>
+      <w:r>
+        <w:t xml:space="preserve"> and </w:t>
+      </w:r>
+      <w:proofErr w:type="spellStart"/>
+      <w:r>
+        <w:t>passed</w:t>
+      </w:r>
+      <w:proofErr w:type="spellEnd"/>
+      <w:r>
+        <w:t xml:space="preserve"> </w:t>
+      </w:r>
+      <w:proofErr w:type="spellStart"/>
+      <w:r>
+        <w:t>to</w:t>
+      </w:r>
+      <w:proofErr w:type="spellEnd"/>
+      <w:r>
+        <w:t xml:space="preserve"> </w:t>
+      </w:r>
+      <w:proofErr w:type="spellStart"/>
+      <w:r>
+        <w:t>t</w:t>
+      </w:r>
+      <w:r>
+        <w:t>he</w:t>
+      </w:r>
+      <w:proofErr w:type="spellEnd"/>
+      <w:r>
+        <w:t xml:space="preserve"> </w:t>
+      </w:r>
+      <w:proofErr w:type="spellStart"/>
+      <w:r>
+        <w:t>target</w:t>
+      </w:r>
+      <w:proofErr w:type="spellEnd"/>
+      <w:r>
+        <w:t xml:space="preserve"> </w:t>
+      </w:r>
+      <w:proofErr w:type="spellStart"/>
+      <w:r>
+        <w:t>application</w:t>
+      </w:r>
+      <w:proofErr w:type="spellEnd"/>
+      <w:r>
+        <w:t xml:space="preserve"> </w:t>
+      </w:r>
+      <w:proofErr w:type="spellStart"/>
+      <w:r>
+        <w:t>for</w:t>
+      </w:r>
+      <w:proofErr w:type="spellEnd"/>
+      <w:r>
+        <w:t xml:space="preserve"> </w:t>
+      </w:r>
+      <w:proofErr w:type="spellStart"/>
+      <w:r>
+        <w:t>further</w:t>
+      </w:r>
+      <w:proofErr w:type="spellEnd"/>
+      <w:r>
+        <w:t xml:space="preserve"> </w:t>
+      </w:r>
+      <w:proofErr w:type="spellStart"/>
+      <w:r>
+        <w:t>handling</w:t>
+      </w:r>
+      <w:proofErr w:type="spellEnd"/>
+      <w:r>
+        <w:t xml:space="preserve">. </w:t>
+      </w:r>
+    </w:p>
+    <w:p/>
     <w:p>
       <w:pPr>
         <w:pStyle w:val="Heading1"/>
@@ -107,7 +1742,7 @@
                     <pic:cNvPicPr/>
                   </pic:nvPicPr>
                   <pic:blipFill>
-                    <a:blip r:embed="rId5"/>
+                    <a:blip r:embed="rId7"/>
                     <a:stretch>
                       <a:fillRect/>
                     </a:stretch>
@@ -346,6 +1981,7 @@
         <w:t xml:space="preserve"> </w:t>
       </w:r>
       <w:proofErr w:type="spellStart"/>
+      <w:proofErr w:type="gramStart"/>
       <w:r>
         <w:t>Portnumber</w:t>
       </w:r>
@@ -358,6 +1994,7 @@
         <w:t>Values</w:t>
       </w:r>
       <w:proofErr w:type="spellEnd"/>
+      <w:proofErr w:type="gramEnd"/>
     </w:p>
     <w:p>
       <w:pPr>
@@ -427,6 +2064,7 @@
         </w:numPr>
       </w:pPr>
       <w:r>
+        <w:lastRenderedPageBreak/>
         <w:t>68</w:t>
       </w:r>
       <w:r>
@@ -459,7 +2097,6 @@
         </w:numPr>
       </w:pPr>
       <w:r>
-        <w:lastRenderedPageBreak/>
         <w:t>520</w:t>
       </w:r>
       <w:r>
@@ -550,6 +2187,7 @@
         <w:t xml:space="preserve"> </w:t>
       </w:r>
       <w:proofErr w:type="spellStart"/>
+      <w:proofErr w:type="gramStart"/>
       <w:r>
         <w:t>Portnumber</w:t>
       </w:r>
@@ -562,6 +2200,7 @@
         <w:t>Values</w:t>
       </w:r>
       <w:proofErr w:type="spellEnd"/>
+      <w:proofErr w:type="gramEnd"/>
     </w:p>
     <w:p>
       <w:pPr>
@@ -1285,7 +2924,6 @@
       </w:pPr>
       <w:proofErr w:type="spellStart"/>
       <w:r>
-        <w:lastRenderedPageBreak/>
         <w:t>Acknowledge</w:t>
       </w:r>
       <w:proofErr w:type="spellEnd"/>
@@ -1622,7 +3260,15 @@
       </w:r>
       <w:proofErr w:type="spellEnd"/>
       <w:r>
-        <w:t xml:space="preserve"> in a </w:t>
+        <w:t xml:space="preserve"> in </w:t>
+      </w:r>
+      <w:proofErr w:type="gramStart"/>
+      <w:r>
+        <w:t>a</w:t>
+      </w:r>
+      <w:proofErr w:type="gramEnd"/>
+      <w:r>
+        <w:t xml:space="preserve"> </w:t>
       </w:r>
       <w:proofErr w:type="spellStart"/>
       <w:r>
@@ -2128,6 +3774,155 @@
     </w:lvl>
   </w:abstractNum>
   <w:abstractNum w:abstractNumId="1" w15:restartNumberingAfterBreak="0">
+    <w:nsid w:val="0D714929"/>
+    <w:multiLevelType w:val="multilevel"/>
+    <w:tmpl w:val="F6965D24"/>
+    <w:lvl w:ilvl="0">
+      <w:start w:val="1"/>
+      <w:numFmt w:val="bullet"/>
+      <w:lvlText w:val=""/>
+      <w:lvlJc w:val="left"/>
+      <w:pPr>
+        <w:tabs>
+          <w:tab w:val="num" w:pos="720"/>
+        </w:tabs>
+        <w:ind w:left="720" w:hanging="360"/>
+      </w:pPr>
+      <w:rPr>
+        <w:rFonts w:ascii="Symbol" w:hAnsi="Symbol" w:hint="default"/>
+        <w:sz w:val="20"/>
+      </w:rPr>
+    </w:lvl>
+    <w:lvl w:ilvl="1" w:tentative="1">
+      <w:start w:val="1"/>
+      <w:numFmt w:val="bullet"/>
+      <w:lvlText w:val="o"/>
+      <w:lvlJc w:val="left"/>
+      <w:pPr>
+        <w:tabs>
+          <w:tab w:val="num" w:pos="1440"/>
+        </w:tabs>
+        <w:ind w:left="1440" w:hanging="360"/>
+      </w:pPr>
+      <w:rPr>
+        <w:rFonts w:ascii="Courier New" w:hAnsi="Courier New" w:hint="default"/>
+        <w:sz w:val="20"/>
+      </w:rPr>
+    </w:lvl>
+    <w:lvl w:ilvl="2" w:tentative="1">
+      <w:start w:val="1"/>
+      <w:numFmt w:val="bullet"/>
+      <w:lvlText w:val=""/>
+      <w:lvlJc w:val="left"/>
+      <w:pPr>
+        <w:tabs>
+          <w:tab w:val="num" w:pos="2160"/>
+        </w:tabs>
+        <w:ind w:left="2160" w:hanging="360"/>
+      </w:pPr>
+      <w:rPr>
+        <w:rFonts w:ascii="Wingdings" w:hAnsi="Wingdings" w:hint="default"/>
+        <w:sz w:val="20"/>
+      </w:rPr>
+    </w:lvl>
+    <w:lvl w:ilvl="3" w:tentative="1">
+      <w:start w:val="1"/>
+      <w:numFmt w:val="bullet"/>
+      <w:lvlText w:val=""/>
+      <w:lvlJc w:val="left"/>
+      <w:pPr>
+        <w:tabs>
+          <w:tab w:val="num" w:pos="2880"/>
+        </w:tabs>
+        <w:ind w:left="2880" w:hanging="360"/>
+      </w:pPr>
+      <w:rPr>
+        <w:rFonts w:ascii="Wingdings" w:hAnsi="Wingdings" w:hint="default"/>
+        <w:sz w:val="20"/>
+      </w:rPr>
+    </w:lvl>
+    <w:lvl w:ilvl="4" w:tentative="1">
+      <w:start w:val="1"/>
+      <w:numFmt w:val="bullet"/>
+      <w:lvlText w:val=""/>
+      <w:lvlJc w:val="left"/>
+      <w:pPr>
+        <w:tabs>
+          <w:tab w:val="num" w:pos="3600"/>
+        </w:tabs>
+        <w:ind w:left="3600" w:hanging="360"/>
+      </w:pPr>
+      <w:rPr>
+        <w:rFonts w:ascii="Wingdings" w:hAnsi="Wingdings" w:hint="default"/>
+        <w:sz w:val="20"/>
+      </w:rPr>
+    </w:lvl>
+    <w:lvl w:ilvl="5" w:tentative="1">
+      <w:start w:val="1"/>
+      <w:numFmt w:val="bullet"/>
+      <w:lvlText w:val=""/>
+      <w:lvlJc w:val="left"/>
+      <w:pPr>
+        <w:tabs>
+          <w:tab w:val="num" w:pos="4320"/>
+        </w:tabs>
+        <w:ind w:left="4320" w:hanging="360"/>
+      </w:pPr>
+      <w:rPr>
+        <w:rFonts w:ascii="Wingdings" w:hAnsi="Wingdings" w:hint="default"/>
+        <w:sz w:val="20"/>
+      </w:rPr>
+    </w:lvl>
+    <w:lvl w:ilvl="6" w:tentative="1">
+      <w:start w:val="1"/>
+      <w:numFmt w:val="bullet"/>
+      <w:lvlText w:val=""/>
+      <w:lvlJc w:val="left"/>
+      <w:pPr>
+        <w:tabs>
+          <w:tab w:val="num" w:pos="5040"/>
+        </w:tabs>
+        <w:ind w:left="5040" w:hanging="360"/>
+      </w:pPr>
+      <w:rPr>
+        <w:rFonts w:ascii="Wingdings" w:hAnsi="Wingdings" w:hint="default"/>
+        <w:sz w:val="20"/>
+      </w:rPr>
+    </w:lvl>
+    <w:lvl w:ilvl="7" w:tentative="1">
+      <w:start w:val="1"/>
+      <w:numFmt w:val="bullet"/>
+      <w:lvlText w:val=""/>
+      <w:lvlJc w:val="left"/>
+      <w:pPr>
+        <w:tabs>
+          <w:tab w:val="num" w:pos="5760"/>
+        </w:tabs>
+        <w:ind w:left="5760" w:hanging="360"/>
+      </w:pPr>
+      <w:rPr>
+        <w:rFonts w:ascii="Wingdings" w:hAnsi="Wingdings" w:hint="default"/>
+        <w:sz w:val="20"/>
+      </w:rPr>
+    </w:lvl>
+    <w:lvl w:ilvl="8" w:tentative="1">
+      <w:start w:val="1"/>
+      <w:numFmt w:val="bullet"/>
+      <w:lvlText w:val=""/>
+      <w:lvlJc w:val="left"/>
+      <w:pPr>
+        <w:tabs>
+          <w:tab w:val="num" w:pos="6480"/>
+        </w:tabs>
+        <w:ind w:left="6480" w:hanging="360"/>
+      </w:pPr>
+      <w:rPr>
+        <w:rFonts w:ascii="Wingdings" w:hAnsi="Wingdings" w:hint="default"/>
+        <w:sz w:val="20"/>
+      </w:rPr>
+    </w:lvl>
+  </w:abstractNum>
+  <w:abstractNum w:abstractNumId="2" w15:restartNumberingAfterBreak="0">
     <w:nsid w:val="134F745B"/>
     <w:multiLevelType w:val="hybridMultilevel"/>
     <w:tmpl w:val="1F20859E"/>
@@ -2216,7 +4011,7 @@
       </w:pPr>
     </w:lvl>
   </w:abstractNum>
-  <w:abstractNum w:abstractNumId="2" w15:restartNumberingAfterBreak="0">
+  <w:abstractNum w:abstractNumId="3" w15:restartNumberingAfterBreak="0">
     <w:nsid w:val="1D2001A4"/>
     <w:multiLevelType w:val="hybridMultilevel"/>
     <w:tmpl w:val="2946E69A"/>
@@ -2328,7 +4123,7 @@
       </w:rPr>
     </w:lvl>
   </w:abstractNum>
-  <w:abstractNum w:abstractNumId="3" w15:restartNumberingAfterBreak="0">
+  <w:abstractNum w:abstractNumId="4" w15:restartNumberingAfterBreak="0">
     <w:nsid w:val="1F751416"/>
     <w:multiLevelType w:val="hybridMultilevel"/>
     <w:tmpl w:val="A3D837E8"/>
@@ -2440,7 +4235,7 @@
       </w:rPr>
     </w:lvl>
   </w:abstractNum>
-  <w:abstractNum w:abstractNumId="4" w15:restartNumberingAfterBreak="0">
+  <w:abstractNum w:abstractNumId="5" w15:restartNumberingAfterBreak="0">
     <w:nsid w:val="3B351C97"/>
     <w:multiLevelType w:val="hybridMultilevel"/>
     <w:tmpl w:val="1E6EDC32"/>
@@ -2552,7 +4347,7 @@
       </w:rPr>
     </w:lvl>
   </w:abstractNum>
-  <w:abstractNum w:abstractNumId="5" w15:restartNumberingAfterBreak="0">
+  <w:abstractNum w:abstractNumId="6" w15:restartNumberingAfterBreak="0">
     <w:nsid w:val="41797BE4"/>
     <w:multiLevelType w:val="hybridMultilevel"/>
     <w:tmpl w:val="73CA7EDC"/>
@@ -2664,7 +4459,7 @@
       </w:rPr>
     </w:lvl>
   </w:abstractNum>
-  <w:abstractNum w:abstractNumId="6" w15:restartNumberingAfterBreak="0">
+  <w:abstractNum w:abstractNumId="7" w15:restartNumberingAfterBreak="0">
     <w:nsid w:val="48052D3F"/>
     <w:multiLevelType w:val="hybridMultilevel"/>
     <w:tmpl w:val="EA5C5DDA"/>
@@ -2753,7 +4548,7 @@
       </w:pPr>
     </w:lvl>
   </w:abstractNum>
-  <w:abstractNum w:abstractNumId="7" w15:restartNumberingAfterBreak="0">
+  <w:abstractNum w:abstractNumId="8" w15:restartNumberingAfterBreak="0">
     <w:nsid w:val="49150073"/>
     <w:multiLevelType w:val="hybridMultilevel"/>
     <w:tmpl w:val="231EAF72"/>
@@ -2842,7 +4637,7 @@
       </w:pPr>
     </w:lvl>
   </w:abstractNum>
-  <w:abstractNum w:abstractNumId="8" w15:restartNumberingAfterBreak="0">
+  <w:abstractNum w:abstractNumId="9" w15:restartNumberingAfterBreak="0">
     <w:nsid w:val="4DCE0CD8"/>
     <w:multiLevelType w:val="hybridMultilevel"/>
     <w:tmpl w:val="E36C6AAE"/>
@@ -2954,7 +4749,7 @@
       </w:rPr>
     </w:lvl>
   </w:abstractNum>
-  <w:abstractNum w:abstractNumId="9" w15:restartNumberingAfterBreak="0">
+  <w:abstractNum w:abstractNumId="10" w15:restartNumberingAfterBreak="0">
     <w:nsid w:val="52850205"/>
     <w:multiLevelType w:val="hybridMultilevel"/>
     <w:tmpl w:val="83248A74"/>
@@ -3066,7 +4861,7 @@
       </w:rPr>
     </w:lvl>
   </w:abstractNum>
-  <w:abstractNum w:abstractNumId="10" w15:restartNumberingAfterBreak="0">
+  <w:abstractNum w:abstractNumId="11" w15:restartNumberingAfterBreak="0">
     <w:nsid w:val="7DFB6515"/>
     <w:multiLevelType w:val="hybridMultilevel"/>
     <w:tmpl w:val="38849052"/>
@@ -3179,37 +4974,40 @@
     </w:lvl>
   </w:abstractNum>
   <w:num w:numId="1" w16cid:durableId="1458447663">
-    <w:abstractNumId w:val="9"/>
+    <w:abstractNumId w:val="10"/>
   </w:num>
   <w:num w:numId="2" w16cid:durableId="149491499">
-    <w:abstractNumId w:val="7"/>
+    <w:abstractNumId w:val="8"/>
   </w:num>
   <w:num w:numId="3" w16cid:durableId="1015569494">
-    <w:abstractNumId w:val="1"/>
+    <w:abstractNumId w:val="2"/>
   </w:num>
   <w:num w:numId="4" w16cid:durableId="612249639">
     <w:abstractNumId w:val="0"/>
   </w:num>
   <w:num w:numId="5" w16cid:durableId="1623464307">
-    <w:abstractNumId w:val="10"/>
+    <w:abstractNumId w:val="11"/>
   </w:num>
   <w:num w:numId="6" w16cid:durableId="351611773">
+    <w:abstractNumId w:val="4"/>
+  </w:num>
+  <w:num w:numId="7" w16cid:durableId="51537882">
+    <w:abstractNumId w:val="7"/>
+  </w:num>
+  <w:num w:numId="8" w16cid:durableId="1430006417">
+    <w:abstractNumId w:val="5"/>
+  </w:num>
+  <w:num w:numId="9" w16cid:durableId="24645574">
+    <w:abstractNumId w:val="6"/>
+  </w:num>
+  <w:num w:numId="10" w16cid:durableId="191844207">
     <w:abstractNumId w:val="3"/>
   </w:num>
-  <w:num w:numId="7" w16cid:durableId="51537882">
-    <w:abstractNumId w:val="6"/>
+  <w:num w:numId="11" w16cid:durableId="143593944">
+    <w:abstractNumId w:val="9"/>
   </w:num>
-  <w:num w:numId="8" w16cid:durableId="1430006417">
-    <w:abstractNumId w:val="4"/>
-  </w:num>
-  <w:num w:numId="9" w16cid:durableId="24645574">
-    <w:abstractNumId w:val="5"/>
-  </w:num>
-  <w:num w:numId="10" w16cid:durableId="191844207">
-    <w:abstractNumId w:val="2"/>
-  </w:num>
-  <w:num w:numId="11" w16cid:durableId="143593944">
-    <w:abstractNumId w:val="8"/>
+  <w:num w:numId="12" w16cid:durableId="1530874396">
+    <w:abstractNumId w:val="1"/>
   </w:num>
 </w:numbering>
 </file>
@@ -3815,7 +5613,6 @@
   <w:style w:type="character" w:default="1" w:styleId="DefaultParagraphFont">
     <w:name w:val="Default Paragraph Font"/>
     <w:uiPriority w:val="1"/>
-    <w:semiHidden/>
     <w:unhideWhenUsed/>
   </w:style>
   <w:style w:type="table" w:default="1" w:styleId="TableNormal">
@@ -4127,6 +5924,29 @@
       <w:spacing w:val="5"/>
     </w:rPr>
   </w:style>
+  <w:style w:type="character" w:styleId="Hyperlink">
+    <w:name w:val="Hyperlink"/>
+    <w:basedOn w:val="DefaultParagraphFont"/>
+    <w:uiPriority w:val="99"/>
+    <w:unhideWhenUsed/>
+    <w:rsid w:val="00B139D6"/>
+    <w:rPr>
+      <w:color w:val="0563C1" w:themeColor="hyperlink"/>
+      <w:u w:val="single"/>
+    </w:rPr>
+  </w:style>
+  <w:style w:type="character" w:styleId="UnresolvedMention">
+    <w:name w:val="Unresolved Mention"/>
+    <w:basedOn w:val="DefaultParagraphFont"/>
+    <w:uiPriority w:val="99"/>
+    <w:semiHidden/>
+    <w:unhideWhenUsed/>
+    <w:rsid w:val="00B139D6"/>
+    <w:rPr>
+      <w:color w:val="605E5C"/>
+      <w:shd w:val="clear" w:color="auto" w:fill="E1DFDD"/>
+    </w:rPr>
+  </w:style>
 </w:styles>
 </file>
 

</xml_diff>